<commit_message>
visao: fix de algumas inconsitencias no texto do documento e seu objetivo como um todo
</commit_message>
<xml_diff>
--- a/docs/documento de visao.docx
+++ b/docs/documento de visao.docx
@@ -13,9 +13,11 @@
       <w:r>
         <w:t xml:space="preserve">Gosling - </w:t>
       </w:r>
+      <w:proofErr w:type="spellStart"/>
       <w:r>
         <w:t>VolunJá</w:t>
       </w:r>
+      <w:proofErr w:type="spellEnd"/>
     </w:p>
     <w:p>
       <w:pPr>
@@ -352,13 +354,31 @@
                 <w:szCs w:val="22"/>
               </w:rPr>
             </w:pPr>
+            <w:proofErr w:type="spellStart"/>
             <w:r>
               <w:rPr>
                 <w:sz w:val="22"/>
                 <w:szCs w:val="22"/>
               </w:rPr>
-              <w:t>Dev Frontend</w:t>
-            </w:r>
+              <w:t>Dev</w:t>
+            </w:r>
+            <w:proofErr w:type="spellEnd"/>
+            <w:r>
+              <w:rPr>
+                <w:sz w:val="22"/>
+                <w:szCs w:val="22"/>
+              </w:rPr>
+              <w:t xml:space="preserve"> </w:t>
+            </w:r>
+            <w:proofErr w:type="spellStart"/>
+            <w:r>
+              <w:rPr>
+                <w:sz w:val="22"/>
+                <w:szCs w:val="22"/>
+              </w:rPr>
+              <w:t>Frontend</w:t>
+            </w:r>
+            <w:proofErr w:type="spellEnd"/>
             <w:r>
               <w:rPr>
                 <w:sz w:val="22"/>
@@ -367,6 +387,7 @@
               </w:rPr>
               <w:t>/</w:t>
             </w:r>
+            <w:proofErr w:type="spellStart"/>
             <w:r>
               <w:rPr>
                 <w:sz w:val="22"/>
@@ -374,6 +395,7 @@
               </w:rPr>
               <w:t>Backend</w:t>
             </w:r>
+            <w:proofErr w:type="spellEnd"/>
           </w:p>
         </w:tc>
         <w:tc>
@@ -603,13 +625,31 @@
                 <w:szCs w:val="22"/>
               </w:rPr>
             </w:pPr>
+            <w:proofErr w:type="spellStart"/>
             <w:r>
               <w:rPr>
                 <w:sz w:val="22"/>
                 <w:szCs w:val="22"/>
               </w:rPr>
-              <w:t>Dev Frontend</w:t>
-            </w:r>
+              <w:t>Dev</w:t>
+            </w:r>
+            <w:proofErr w:type="spellEnd"/>
+            <w:r>
+              <w:rPr>
+                <w:sz w:val="22"/>
+                <w:szCs w:val="22"/>
+              </w:rPr>
+              <w:t xml:space="preserve"> </w:t>
+            </w:r>
+            <w:proofErr w:type="spellStart"/>
+            <w:r>
+              <w:rPr>
+                <w:sz w:val="22"/>
+                <w:szCs w:val="22"/>
+              </w:rPr>
+              <w:t>Frontend</w:t>
+            </w:r>
+            <w:proofErr w:type="spellEnd"/>
             <w:r>
               <w:rPr>
                 <w:sz w:val="22"/>
@@ -618,6 +658,7 @@
               </w:rPr>
               <w:t>/</w:t>
             </w:r>
+            <w:proofErr w:type="spellStart"/>
             <w:r>
               <w:rPr>
                 <w:sz w:val="22"/>
@@ -625,6 +666,7 @@
               </w:rPr>
               <w:t>Backend</w:t>
             </w:r>
+            <w:proofErr w:type="spellEnd"/>
           </w:p>
         </w:tc>
         <w:tc>
@@ -736,13 +778,31 @@
                 <w:szCs w:val="22"/>
               </w:rPr>
             </w:pPr>
+            <w:proofErr w:type="spellStart"/>
             <w:r>
               <w:rPr>
                 <w:sz w:val="22"/>
                 <w:szCs w:val="22"/>
               </w:rPr>
-              <w:t>Dev Frontend</w:t>
-            </w:r>
+              <w:t>Dev</w:t>
+            </w:r>
+            <w:proofErr w:type="spellEnd"/>
+            <w:r>
+              <w:rPr>
+                <w:sz w:val="22"/>
+                <w:szCs w:val="22"/>
+              </w:rPr>
+              <w:t xml:space="preserve"> </w:t>
+            </w:r>
+            <w:proofErr w:type="spellStart"/>
+            <w:r>
+              <w:rPr>
+                <w:sz w:val="22"/>
+                <w:szCs w:val="22"/>
+              </w:rPr>
+              <w:t>Frontend</w:t>
+            </w:r>
+            <w:proofErr w:type="spellEnd"/>
             <w:r>
               <w:rPr>
                 <w:sz w:val="22"/>
@@ -751,6 +811,7 @@
               </w:rPr>
               <w:t>/</w:t>
             </w:r>
+            <w:proofErr w:type="spellStart"/>
             <w:r>
               <w:rPr>
                 <w:sz w:val="22"/>
@@ -758,6 +819,7 @@
               </w:rPr>
               <w:t>Backend</w:t>
             </w:r>
+            <w:proofErr w:type="spellEnd"/>
           </w:p>
         </w:tc>
         <w:tc>
@@ -1270,7 +1332,23 @@
                 <w:sz w:val="22"/>
                 <w:szCs w:val="22"/>
               </w:rPr>
-              <w:t>Estruturação do documento conforme template da disciplina; registro do problema, da declaração de posição do produto, dos objetivos, do escopo inicial e do backlog preliminar</w:t>
+              <w:t xml:space="preserve">Estruturação do documento conforme </w:t>
+            </w:r>
+            <w:proofErr w:type="spellStart"/>
+            <w:r>
+              <w:rPr>
+                <w:sz w:val="22"/>
+                <w:szCs w:val="22"/>
+              </w:rPr>
+              <w:t>template</w:t>
+            </w:r>
+            <w:proofErr w:type="spellEnd"/>
+            <w:r>
+              <w:rPr>
+                <w:sz w:val="22"/>
+                <w:szCs w:val="22"/>
+              </w:rPr>
+              <w:t xml:space="preserve"> da disciplina; registro do problema, da declaração de posição do produto, dos objetivos, do escopo inicial e do backlog preliminar</w:t>
             </w:r>
           </w:p>
         </w:tc>
@@ -1387,7 +1465,23 @@
                 <w:sz w:val="22"/>
                 <w:szCs w:val="22"/>
               </w:rPr>
-              <w:t>Preenchimento completo do documento no template da disciplina (seções 1 a 7), com espaços reservados para as informações pendentes</w:t>
+              <w:t xml:space="preserve">Preenchimento completo do documento no </w:t>
+            </w:r>
+            <w:proofErr w:type="spellStart"/>
+            <w:r>
+              <w:rPr>
+                <w:sz w:val="22"/>
+                <w:szCs w:val="22"/>
+              </w:rPr>
+              <w:t>template</w:t>
+            </w:r>
+            <w:proofErr w:type="spellEnd"/>
+            <w:r>
+              <w:rPr>
+                <w:sz w:val="22"/>
+                <w:szCs w:val="22"/>
+              </w:rPr>
+              <w:t xml:space="preserve"> da disciplina (seções 1 a 7), com espaços reservados para as informações pendentes</w:t>
             </w:r>
           </w:p>
         </w:tc>
@@ -4021,7 +4115,13 @@
         <w:pStyle w:val="Corpodetexto"/>
       </w:pPr>
       <w:r>
-        <w:t>O trabalho voluntário é um dos principais insumos do terceiro setor brasileiro. Organizações Não Governamentais (ONGs), associações e projetos sociais dependem de pessoas dispostas a doar tempo e competências para executar suas atividades-fim - acolhimento, educação, saúde, assistência, cultura, meio ambiente e defesa de direitos. Do outro lado, existe um contingente de pessoas interessadas em atuar como voluntárias, mas que não sabe onde procurar oportunidades.</w:t>
+        <w:t xml:space="preserve">O trabalho voluntário é um dos principais insumos do terceiro setor brasileiro. Organizações Não Governamentais (ONGs), associações e projetos sociais </w:t>
+      </w:r>
+      <w:r>
+        <w:t xml:space="preserve">atrelados a essas organizações </w:t>
+      </w:r>
+      <w:r>
+        <w:t>dependem de pessoas dispostas a doar tempo e competências para executar suas atividades-fim - acolhimento, educação, saúde, assistência, cultura, meio ambiente e defesa de direitos. Do outro lado, existe um contingente de pessoas interessadas em atuar como voluntárias, mas que não sabe onde procurar oportunidades.</w:t>
       </w:r>
     </w:p>
     <w:p>
@@ -4039,7 +4139,15 @@
         <w:t>descentralizada e informal</w:t>
       </w:r>
       <w:r>
-        <w:t xml:space="preserve">: acontece em perfis de redes sociais, grupos de mensagens, cartazes, sites próprios de cada organização e pelo boca a boca. Assim, a oferta (vagas das ONGs) e a demanda (pessoas dispostas a se voluntariar) não se encontram de forma sistemática e, quando se encontram, frequentemente há incompatibilidade de </w:t>
+        <w:t xml:space="preserve">: acontece em perfis de redes sociais, grupos de mensagens, cartazes, sites próprios de cada organização e </w:t>
+      </w:r>
+      <w:proofErr w:type="gramStart"/>
+      <w:r>
+        <w:t>pelo boca</w:t>
+      </w:r>
+      <w:proofErr w:type="gramEnd"/>
+      <w:r>
+        <w:t xml:space="preserve"> a boca. Assim, a oferta (vagas das ONGs) e a demanda (pessoas dispostas a se voluntariar) não se encontram de forma sistemática e, quando se encontram, frequentemente há incompatibilidade de </w:t>
       </w:r>
       <w:r>
         <w:rPr>
@@ -4685,7 +4793,15 @@
         <w:t>foco em UX</w:t>
       </w:r>
       <w:r>
-        <w:t xml:space="preserve"> faz parte da solução: como o público é heterogêneo em idade e familiaridade digital, uma interface confusa reproduziria dentro do sistema a mesma barreira que existe fora dele. Por isso, usabilidade e acessibilidade são requisitos obrigatórios do backlog (seção 4.4) e são medidas conforme a seção 5.1.</w:t>
+        <w:t xml:space="preserve"> faz parte da solução: como o público é heterogêneo em idade e familiaridade digital, uma interface confusa reproduziria dentro do sistema a mesma barreira que existe fora dele. Por isso, usabilidade e acessibilidade são </w:t>
+      </w:r>
+      <w:proofErr w:type="gramStart"/>
+      <w:r>
+        <w:t>requisitos</w:t>
+      </w:r>
+      <w:proofErr w:type="gramEnd"/>
+      <w:r>
+        <w:t xml:space="preserve"> do backlog (seção 4.4) e são medidas conforme a seção 5.1.</w:t>
       </w:r>
     </w:p>
     <w:p>
@@ -4808,7 +4924,19 @@
               <w:rPr>
                 <w:sz w:val="20"/>
               </w:rPr>
-              <w:t>Pessoas interessadas em realizar trabalho voluntário e organizações do terceiro setor (ONGs, associações e projetos sociais) que necessitam de voluntários.</w:t>
+              <w:t>Pessoas interessadas em realizar trabalho voluntário e organizações do terceiro setor (ONGs</w:t>
+            </w:r>
+            <w:r>
+              <w:rPr>
+                <w:sz w:val="20"/>
+              </w:rPr>
+              <w:t xml:space="preserve"> e </w:t>
+            </w:r>
+            <w:r>
+              <w:rPr>
+                <w:sz w:val="20"/>
+              </w:rPr>
+              <w:t>associações) que necessitam de voluntários.</w:t>
             </w:r>
           </w:p>
         </w:tc>
@@ -4910,6 +5038,7 @@
               </w:rPr>
               <w:t xml:space="preserve">O </w:t>
             </w:r>
+            <w:proofErr w:type="spellStart"/>
             <w:r>
               <w:rPr>
                 <w:b/>
@@ -4918,6 +5047,7 @@
               </w:rPr>
               <w:t>VolunJá</w:t>
             </w:r>
+            <w:proofErr w:type="spellEnd"/>
           </w:p>
         </w:tc>
         <w:tc>
@@ -5553,7 +5683,21 @@
               <w:rPr>
                 <w:sz w:val="20"/>
               </w:rPr>
-              <w:t>Professor da disciplina, que acompanha o histórico de commits e o desenvolvimento do projeto; tem como ponto de contato com a equipe o monitor responsável pelo grupo Gosling.</w:t>
+              <w:t xml:space="preserve">Professor da disciplina, que acompanha o histórico de </w:t>
+            </w:r>
+            <w:proofErr w:type="spellStart"/>
+            <w:r>
+              <w:rPr>
+                <w:sz w:val="20"/>
+              </w:rPr>
+              <w:t>commits</w:t>
+            </w:r>
+            <w:proofErr w:type="spellEnd"/>
+            <w:r>
+              <w:rPr>
+                <w:sz w:val="20"/>
+              </w:rPr>
+              <w:t xml:space="preserve"> e o desenvolvimento do projeto; tem como ponto de contato com a equipe o monitor responsável pelo grupo Gosling.</w:t>
             </w:r>
           </w:p>
         </w:tc>
@@ -5579,7 +5723,21 @@
               <w:rPr>
                 <w:sz w:val="20"/>
               </w:rPr>
-              <w:t>Avalia se o produto atende aos seus usuários-alvo e se cumpre os requisitos previamente delimitados pelo escopo do problema, sendo quem valida e homologa as entregas da equipe.</w:t>
+              <w:t xml:space="preserve">Avalia se o produto atende aos seus usuários-alvo e se cumpre os requisitos previamente delimitados pelo escopo do problema, sendo quem </w:t>
+            </w:r>
+            <w:proofErr w:type="spellStart"/>
+            <w:r>
+              <w:rPr>
+                <w:sz w:val="20"/>
+              </w:rPr>
+              <w:t>valida</w:t>
+            </w:r>
+            <w:proofErr w:type="spellEnd"/>
+            <w:r>
+              <w:rPr>
+                <w:sz w:val="20"/>
+              </w:rPr>
+              <w:t xml:space="preserve"> e homologa as entregas da equipe.</w:t>
             </w:r>
           </w:p>
         </w:tc>
@@ -5950,6 +6108,7 @@
                 <w:sz w:val="20"/>
               </w:rPr>
             </w:pPr>
+            <w:proofErr w:type="spellStart"/>
             <w:r>
               <w:rPr>
                 <w:b/>
@@ -5958,6 +6117,7 @@
               </w:rPr>
               <w:t>InfoJobs</w:t>
             </w:r>
+            <w:proofErr w:type="spellEnd"/>
           </w:p>
         </w:tc>
         <w:tc>
@@ -6529,11 +6689,19 @@
                 <w:sz w:val="20"/>
               </w:rPr>
             </w:pPr>
-            <w:r>
-              <w:rPr>
-                <w:sz w:val="20"/>
-              </w:rPr>
-              <w:t>Git e GitHub</w:t>
+            <w:proofErr w:type="spellStart"/>
+            <w:r>
+              <w:rPr>
+                <w:sz w:val="20"/>
+              </w:rPr>
+              <w:t>Git</w:t>
+            </w:r>
+            <w:proofErr w:type="spellEnd"/>
+            <w:r>
+              <w:rPr>
+                <w:sz w:val="20"/>
+              </w:rPr>
+              <w:t xml:space="preserve"> e GitHub</w:t>
             </w:r>
           </w:p>
         </w:tc>
@@ -6612,12 +6780,28 @@
                 <w:sz w:val="20"/>
               </w:rPr>
             </w:pPr>
-            <w:r>
-              <w:rPr>
-                <w:sz w:val="20"/>
-              </w:rPr>
-              <w:t>MkDocs (tema Material), publicado no GitHub Pages via GitHub Actions</w:t>
-            </w:r>
+            <w:proofErr w:type="spellStart"/>
+            <w:r>
+              <w:rPr>
+                <w:sz w:val="20"/>
+              </w:rPr>
+              <w:t>MkDocs</w:t>
+            </w:r>
+            <w:proofErr w:type="spellEnd"/>
+            <w:r>
+              <w:rPr>
+                <w:sz w:val="20"/>
+              </w:rPr>
+              <w:t xml:space="preserve"> (tema Material), publicado no GitHub Pages via GitHub </w:t>
+            </w:r>
+            <w:proofErr w:type="spellStart"/>
+            <w:r>
+              <w:rPr>
+                <w:sz w:val="20"/>
+              </w:rPr>
+              <w:t>Actions</w:t>
+            </w:r>
+            <w:proofErr w:type="spellEnd"/>
           </w:p>
         </w:tc>
         <w:tc>
@@ -6673,8 +6857,16 @@
               <w:rPr>
                 <w:sz w:val="20"/>
               </w:rPr>
-              <w:t>Política de branches</w:t>
-            </w:r>
+              <w:t xml:space="preserve">Política de </w:t>
+            </w:r>
+            <w:proofErr w:type="spellStart"/>
+            <w:r>
+              <w:rPr>
+                <w:sz w:val="20"/>
+              </w:rPr>
+              <w:t>branches</w:t>
+            </w:r>
+            <w:proofErr w:type="spellEnd"/>
           </w:p>
         </w:tc>
         <w:tc>
@@ -6695,11 +6887,33 @@
                 <w:sz w:val="20"/>
               </w:rPr>
             </w:pPr>
-            <w:r>
-              <w:rPr>
-                <w:sz w:val="20"/>
-              </w:rPr>
-              <w:t>main (produção) e developer (desenvolvimento)</w:t>
+            <w:proofErr w:type="spellStart"/>
+            <w:r>
+              <w:rPr>
+                <w:sz w:val="20"/>
+              </w:rPr>
+              <w:t>main</w:t>
+            </w:r>
+            <w:proofErr w:type="spellEnd"/>
+            <w:r>
+              <w:rPr>
+                <w:sz w:val="20"/>
+              </w:rPr>
+              <w:t xml:space="preserve"> (produção) e </w:t>
+            </w:r>
+            <w:proofErr w:type="spellStart"/>
+            <w:r>
+              <w:rPr>
+                <w:sz w:val="20"/>
+              </w:rPr>
+              <w:t>developer</w:t>
+            </w:r>
+            <w:proofErr w:type="spellEnd"/>
+            <w:r>
+              <w:rPr>
+                <w:sz w:val="20"/>
+              </w:rPr>
+              <w:t xml:space="preserve"> (desenvolvimento)</w:t>
             </w:r>
           </w:p>
         </w:tc>
@@ -6758,8 +6972,18 @@
                 <w:iCs/>
                 <w:sz w:val="20"/>
               </w:rPr>
-              <w:t>Front-end</w:t>
-            </w:r>
+              <w:t>Front-</w:t>
+            </w:r>
+            <w:proofErr w:type="spellStart"/>
+            <w:r>
+              <w:rPr>
+                <w:i/>
+                <w:iCs/>
+                <w:sz w:val="20"/>
+              </w:rPr>
+              <w:t>end</w:t>
+            </w:r>
+            <w:proofErr w:type="spellEnd"/>
           </w:p>
         </w:tc>
         <w:tc>
@@ -6784,8 +7008,16 @@
               <w:rPr>
                 <w:sz w:val="20"/>
               </w:rPr>
-              <w:t>Javascript, utilizando React</w:t>
-            </w:r>
+              <w:t xml:space="preserve">Javascript, utilizando </w:t>
+            </w:r>
+            <w:proofErr w:type="spellStart"/>
+            <w:r>
+              <w:rPr>
+                <w:sz w:val="20"/>
+              </w:rPr>
+              <w:t>React</w:t>
+            </w:r>
+            <w:proofErr w:type="spellEnd"/>
           </w:p>
         </w:tc>
         <w:tc>
@@ -6843,8 +7075,18 @@
                 <w:iCs/>
                 <w:sz w:val="20"/>
               </w:rPr>
-              <w:t>Back-end</w:t>
-            </w:r>
+              <w:t>Back-</w:t>
+            </w:r>
+            <w:proofErr w:type="spellStart"/>
+            <w:r>
+              <w:rPr>
+                <w:i/>
+                <w:iCs/>
+                <w:sz w:val="20"/>
+              </w:rPr>
+              <w:t>end</w:t>
+            </w:r>
+            <w:proofErr w:type="spellEnd"/>
           </w:p>
         </w:tc>
         <w:tc>
@@ -7031,12 +7273,14 @@
                 <w:sz w:val="20"/>
               </w:rPr>
             </w:pPr>
+            <w:proofErr w:type="spellStart"/>
             <w:r>
               <w:rPr>
                 <w:sz w:val="20"/>
               </w:rPr>
               <w:t>Figma</w:t>
             </w:r>
+            <w:proofErr w:type="spellEnd"/>
           </w:p>
         </w:tc>
         <w:tc>
@@ -7125,8 +7369,30 @@
               <w:rPr>
                 <w:sz w:val="20"/>
               </w:rPr>
-              <w:t>Backlog registrados via md Branch developer</w:t>
-            </w:r>
+              <w:t xml:space="preserve">Backlog registrados via </w:t>
+            </w:r>
+            <w:proofErr w:type="spellStart"/>
+            <w:r>
+              <w:rPr>
+                <w:sz w:val="20"/>
+              </w:rPr>
+              <w:t>md</w:t>
+            </w:r>
+            <w:proofErr w:type="spellEnd"/>
+            <w:r>
+              <w:rPr>
+                <w:sz w:val="20"/>
+              </w:rPr>
+              <w:t xml:space="preserve"> Branch </w:t>
+            </w:r>
+            <w:proofErr w:type="spellStart"/>
+            <w:r>
+              <w:rPr>
+                <w:sz w:val="20"/>
+              </w:rPr>
+              <w:t>developer</w:t>
+            </w:r>
+            <w:proofErr w:type="spellEnd"/>
           </w:p>
         </w:tc>
         <w:tc>
@@ -7208,7 +7474,21 @@
               <w:rPr>
                 <w:sz w:val="20"/>
               </w:rPr>
-              <w:t>Partes de automação no actions e partes de UX.</w:t>
+              <w:t xml:space="preserve">Partes de automação no </w:t>
+            </w:r>
+            <w:proofErr w:type="spellStart"/>
+            <w:r>
+              <w:rPr>
+                <w:sz w:val="20"/>
+              </w:rPr>
+              <w:t>actions</w:t>
+            </w:r>
+            <w:proofErr w:type="spellEnd"/>
+            <w:r>
+              <w:rPr>
+                <w:sz w:val="20"/>
+              </w:rPr>
+              <w:t xml:space="preserve"> e partes de UX.</w:t>
             </w:r>
           </w:p>
         </w:tc>
@@ -7291,7 +7571,21 @@
               <w:rPr>
                 <w:sz w:val="20"/>
               </w:rPr>
-              <w:t>Scrum e XP (seção 3); MoSCoW (seção 4.1); GQM (seção 5.1); Ishikawa (seção 1.1)</w:t>
+              <w:t xml:space="preserve">Scrum e XP (seção 3); </w:t>
+            </w:r>
+            <w:proofErr w:type="spellStart"/>
+            <w:r>
+              <w:rPr>
+                <w:sz w:val="20"/>
+              </w:rPr>
+              <w:t>MoSCoW</w:t>
+            </w:r>
+            <w:proofErr w:type="spellEnd"/>
+            <w:r>
+              <w:rPr>
+                <w:sz w:val="20"/>
+              </w:rPr>
+              <w:t xml:space="preserve"> (seção 4.1); GQM (seção 5.1); Ishikawa (seção 1.1)</w:t>
             </w:r>
           </w:p>
         </w:tc>
@@ -7541,7 +7835,23 @@
         <w:t>Procedimentos:</w:t>
       </w:r>
       <w:r>
-        <w:t xml:space="preserve"> cerimônias do Scrum, conceito de preparado (DoR) e conceito de pronto (DoD).</w:t>
+        <w:t xml:space="preserve"> cerimônias do Scrum, conceito de preparado (</w:t>
+      </w:r>
+      <w:proofErr w:type="spellStart"/>
+      <w:r>
+        <w:t>DoR</w:t>
+      </w:r>
+      <w:proofErr w:type="spellEnd"/>
+      <w:r>
+        <w:t>) e conceito de pronto (</w:t>
+      </w:r>
+      <w:proofErr w:type="spellStart"/>
+      <w:r>
+        <w:t>DoD</w:t>
+      </w:r>
+      <w:proofErr w:type="spellEnd"/>
+      <w:r>
+        <w:t>).</w:t>
       </w:r>
     </w:p>
     <w:p>
@@ -7561,7 +7871,15 @@
         <w:t>Métodos:</w:t>
       </w:r>
       <w:r>
-        <w:t xml:space="preserve"> MoSCoW, GQM, diagrama de Ishikawa e testes de usabilidade.</w:t>
+        <w:t xml:space="preserve"> </w:t>
+      </w:r>
+      <w:proofErr w:type="spellStart"/>
+      <w:r>
+        <w:t>MoSCoW</w:t>
+      </w:r>
+      <w:proofErr w:type="spellEnd"/>
+      <w:r>
+        <w:t>, GQM, diagrama de Ishikawa e testes de usabilidade.</w:t>
       </w:r>
     </w:p>
     <w:p>
@@ -8506,7 +8824,15 @@
         <w:pStyle w:val="Corpodetexto"/>
       </w:pPr>
       <w:r>
-        <w:t>O projeto é organizado em 11 sprints de 7 dias, de quarta a terça-feira, alinhadas ao cronograma da disciplina. As Sprints 1 a 5 cobrem a documentação: entrega do Documento de Visão em 30/09 e do Documento de Arquitetura em 07/10, com apresentações em 14/10 e 19/10. As Sprints 6 a 11 cobrem o desenvolvimento, do kick-off em 26/10 à apresentação do software em funcionamento. A Tabela 3 é atualizada ao final de cada sprint, com o percentual de conclusão em intervalos mínimos de 10%.</w:t>
+        <w:t xml:space="preserve">O projeto é organizado em 11 sprints de 7 dias, de quarta a terça-feira, alinhadas ao cronograma da disciplina. As Sprints 1 a 5 cobrem a documentação: entrega do Documento de Visão em 30/09 e do Documento de Arquitetura em 07/10, com apresentações em 14/10 e 19/10. As Sprints 6 a 11 cobrem o desenvolvimento, do </w:t>
+      </w:r>
+      <w:proofErr w:type="spellStart"/>
+      <w:r>
+        <w:t>kick</w:t>
+      </w:r>
+      <w:proofErr w:type="spellEnd"/>
+      <w:r>
+        <w:t>-off em 26/10 à apresentação do software em funcionamento. A Tabela 3 é atualizada ao final de cada sprint, com o percentual de conclusão em intervalos mínimos de 10%.</w:t>
       </w:r>
     </w:p>
     <w:p>
@@ -9831,12 +10157,21 @@
                 <w:szCs w:val="18"/>
               </w:rPr>
             </w:pPr>
-            <w:r>
-              <w:rPr>
-                <w:sz w:val="18"/>
-                <w:szCs w:val="18"/>
-              </w:rPr>
-              <w:t>Kick-off do desenvolvimento: cadastro e autenticação (CN01)</w:t>
+            <w:proofErr w:type="spellStart"/>
+            <w:r>
+              <w:rPr>
+                <w:sz w:val="18"/>
+                <w:szCs w:val="18"/>
+              </w:rPr>
+              <w:t>Kick</w:t>
+            </w:r>
+            <w:proofErr w:type="spellEnd"/>
+            <w:r>
+              <w:rPr>
+                <w:sz w:val="18"/>
+                <w:szCs w:val="18"/>
+              </w:rPr>
+              <w:t>-off do desenvolvimento: cadastro e autenticação (CN01)</w:t>
             </w:r>
           </w:p>
         </w:tc>
@@ -11642,7 +11977,15 @@
         <w:pStyle w:val="Corpodetexto"/>
       </w:pPr>
       <w:r>
-        <w:t>Canais utilizados: Discord.</w:t>
+        <w:t xml:space="preserve">Canais utilizados: </w:t>
+      </w:r>
+      <w:proofErr w:type="spellStart"/>
+      <w:r>
+        <w:t>Discord</w:t>
+      </w:r>
+      <w:proofErr w:type="spellEnd"/>
+      <w:r>
+        <w:t>.</w:t>
       </w:r>
     </w:p>
     <w:p>
@@ -12077,7 +12420,21 @@
               <w:rPr>
                 <w:sz w:val="20"/>
               </w:rPr>
-              <w:t>Simplificar a solução técnica e adiar requisitos Could.</w:t>
+              <w:t xml:space="preserve">Simplificar a solução técnica e adiar requisitos </w:t>
+            </w:r>
+            <w:proofErr w:type="spellStart"/>
+            <w:r>
+              <w:rPr>
+                <w:sz w:val="20"/>
+              </w:rPr>
+              <w:t>Could</w:t>
+            </w:r>
+            <w:proofErr w:type="spellEnd"/>
+            <w:r>
+              <w:rPr>
+                <w:sz w:val="20"/>
+              </w:rPr>
+              <w:t>.</w:t>
             </w:r>
           </w:p>
         </w:tc>
@@ -12168,7 +12525,21 @@
               <w:rPr>
                 <w:sz w:val="20"/>
               </w:rPr>
-              <w:t>Priorizar com MoSCoW e fechar o MVP apenas com requisitos Must.</w:t>
+              <w:t xml:space="preserve">Priorizar com </w:t>
+            </w:r>
+            <w:proofErr w:type="spellStart"/>
+            <w:r>
+              <w:rPr>
+                <w:sz w:val="20"/>
+              </w:rPr>
+              <w:t>MoSCoW</w:t>
+            </w:r>
+            <w:proofErr w:type="spellEnd"/>
+            <w:r>
+              <w:rPr>
+                <w:sz w:val="20"/>
+              </w:rPr>
+              <w:t xml:space="preserve"> e fechar o MVP apenas com requisitos Must.</w:t>
             </w:r>
           </w:p>
         </w:tc>
@@ -12194,7 +12565,21 @@
               <w:rPr>
                 <w:sz w:val="20"/>
               </w:rPr>
-              <w:t>Acionar o replanejamento (seção 2.6) e cortar requisitos Should e Could.</w:t>
+              <w:t xml:space="preserve">Acionar o replanejamento (seção 2.6) e cortar requisitos Should e </w:t>
+            </w:r>
+            <w:proofErr w:type="spellStart"/>
+            <w:r>
+              <w:rPr>
+                <w:sz w:val="20"/>
+              </w:rPr>
+              <w:t>Could</w:t>
+            </w:r>
+            <w:proofErr w:type="spellEnd"/>
+            <w:r>
+              <w:rPr>
+                <w:sz w:val="20"/>
+              </w:rPr>
+              <w:t>.</w:t>
             </w:r>
           </w:p>
         </w:tc>
@@ -12515,11 +12900,19 @@
                 <w:sz w:val="20"/>
               </w:rPr>
             </w:pPr>
-            <w:r>
-              <w:rPr>
-                <w:sz w:val="20"/>
-              </w:rPr>
-              <w:t>Prototipar antes de codificar e testar a usabilidade a cada incremento.</w:t>
+            <w:proofErr w:type="spellStart"/>
+            <w:r>
+              <w:rPr>
+                <w:sz w:val="20"/>
+              </w:rPr>
+              <w:t>Prototipar</w:t>
+            </w:r>
+            <w:proofErr w:type="spellEnd"/>
+            <w:r>
+              <w:rPr>
+                <w:sz w:val="20"/>
+              </w:rPr>
+              <w:t xml:space="preserve"> antes de codificar e testar a usabilidade a cada incremento.</w:t>
             </w:r>
           </w:p>
         </w:tc>
@@ -12987,7 +13380,15 @@
         <w:t>Design de interface</w:t>
       </w:r>
       <w:r>
-        <w:t xml:space="preserve"> (Designer/UX): prototipar os itens antes de codificar.</w:t>
+        <w:t xml:space="preserve"> (Designer/UX): </w:t>
+      </w:r>
+      <w:proofErr w:type="spellStart"/>
+      <w:r>
+        <w:t>prototipar</w:t>
+      </w:r>
+      <w:proofErr w:type="spellEnd"/>
+      <w:r>
+        <w:t xml:space="preserve"> os itens antes de codificar.</w:t>
       </w:r>
     </w:p>
     <w:p>
@@ -13137,15 +13538,49 @@
         <w:t>Integração contínua</w:t>
       </w:r>
       <w:r>
-        <w:t xml:space="preserve"> na branch developer, com </w:t>
-      </w:r>
+        <w:t xml:space="preserve"> na </w:t>
+      </w:r>
+      <w:proofErr w:type="spellStart"/>
+      <w:r>
+        <w:t>branch</w:t>
+      </w:r>
+      <w:proofErr w:type="spellEnd"/>
+      <w:r>
+        <w:t xml:space="preserve"> </w:t>
+      </w:r>
+      <w:proofErr w:type="spellStart"/>
+      <w:r>
+        <w:t>developer</w:t>
+      </w:r>
+      <w:proofErr w:type="spellEnd"/>
+      <w:r>
+        <w:t xml:space="preserve">, com </w:t>
+      </w:r>
+      <w:proofErr w:type="spellStart"/>
       <w:r>
         <w:rPr>
           <w:i/>
           <w:iCs/>
         </w:rPr>
-        <w:t>pull requests</w:t>
-      </w:r>
+        <w:t>pull</w:t>
+      </w:r>
+      <w:proofErr w:type="spellEnd"/>
+      <w:r>
+        <w:rPr>
+          <w:i/>
+          <w:iCs/>
+        </w:rPr>
+        <w:t xml:space="preserve"> </w:t>
+      </w:r>
+      <w:proofErr w:type="spellStart"/>
+      <w:r>
+        <w:rPr>
+          <w:i/>
+          <w:iCs/>
+        </w:rPr>
+        <w:t>requests</w:t>
+      </w:r>
+      <w:proofErr w:type="spellEnd"/>
       <w:r>
         <w:t xml:space="preserve"> revisados antes do </w:t>
       </w:r>
@@ -13239,10 +13674,34 @@
           <w:b/>
           <w:bCs/>
         </w:rPr>
-        <w:t>Preparado (DoR):</w:t>
-      </w:r>
-      <w:r>
-        <w:t xml:space="preserve"> o item só entra na sprint se tiver critérios de aceitação claros, prioridade MoSCoW definida e cenário associado (Tabela 5).</w:t>
+        <w:t>Preparado (</w:t>
+      </w:r>
+      <w:proofErr w:type="spellStart"/>
+      <w:r>
+        <w:rPr>
+          <w:b/>
+          <w:bCs/>
+        </w:rPr>
+        <w:t>DoR</w:t>
+      </w:r>
+      <w:proofErr w:type="spellEnd"/>
+      <w:r>
+        <w:rPr>
+          <w:b/>
+          <w:bCs/>
+        </w:rPr>
+        <w:t>):</w:t>
+      </w:r>
+      <w:r>
+        <w:t xml:space="preserve"> o item só entra na sprint se tiver critérios de aceitação claros, prioridade </w:t>
+      </w:r>
+      <w:proofErr w:type="spellStart"/>
+      <w:r>
+        <w:t>MoSCoW</w:t>
+      </w:r>
+      <w:proofErr w:type="spellEnd"/>
+      <w:r>
+        <w:t xml:space="preserve"> definida e cenário associado (Tabela 5).</w:t>
       </w:r>
     </w:p>
     <w:p>
@@ -13254,18 +13713,68 @@
           <w:b/>
           <w:bCs/>
         </w:rPr>
-        <w:t>Pronto (DoD):</w:t>
-      </w:r>
-      <w:r>
-        <w:t xml:space="preserve"> o item só é concluído quando está integrado à branch developer por </w:t>
-      </w:r>
+        <w:t>Pronto (</w:t>
+      </w:r>
+      <w:proofErr w:type="spellStart"/>
+      <w:r>
+        <w:rPr>
+          <w:b/>
+          <w:bCs/>
+        </w:rPr>
+        <w:t>DoD</w:t>
+      </w:r>
+      <w:proofErr w:type="spellEnd"/>
+      <w:r>
+        <w:rPr>
+          <w:b/>
+          <w:bCs/>
+        </w:rPr>
+        <w:t>):</w:t>
+      </w:r>
+      <w:r>
+        <w:t xml:space="preserve"> o item só é concluído quando está integrado à </w:t>
+      </w:r>
+      <w:proofErr w:type="spellStart"/>
+      <w:r>
+        <w:t>branch</w:t>
+      </w:r>
+      <w:proofErr w:type="spellEnd"/>
+      <w:r>
+        <w:t xml:space="preserve"> </w:t>
+      </w:r>
+      <w:proofErr w:type="spellStart"/>
+      <w:r>
+        <w:t>developer</w:t>
+      </w:r>
+      <w:proofErr w:type="spellEnd"/>
+      <w:r>
+        <w:t xml:space="preserve"> por </w:t>
+      </w:r>
+      <w:proofErr w:type="spellStart"/>
       <w:r>
         <w:rPr>
           <w:i/>
           <w:iCs/>
         </w:rPr>
-        <w:t>pull request</w:t>
-      </w:r>
+        <w:t>pull</w:t>
+      </w:r>
+      <w:proofErr w:type="spellEnd"/>
+      <w:r>
+        <w:rPr>
+          <w:i/>
+          <w:iCs/>
+        </w:rPr>
+        <w:t xml:space="preserve"> </w:t>
+      </w:r>
+      <w:proofErr w:type="spellStart"/>
+      <w:r>
+        <w:rPr>
+          <w:i/>
+          <w:iCs/>
+        </w:rPr>
+        <w:t>request</w:t>
+      </w:r>
+      <w:proofErr w:type="spellEnd"/>
       <w:r>
         <w:t xml:space="preserve"> revisado, tem testes automatizados passando, atende aos critérios de aceitação e passou pelo roteiro de testes da seção 6.2.</w:t>
       </w:r>
@@ -13406,7 +13915,15 @@
         <w:pStyle w:val="Corpodetexto"/>
       </w:pPr>
       <w:r>
-        <w:t>O backlog é organizado por perfis (seção 4.2) e cenários (seção 4.3) e detalhado na Tabela 6 (seção 4.4). A priorização usa a técnica MoSCoW, com o seguinte significado para este produto, a ser validado pelo P.O.:</w:t>
+        <w:t xml:space="preserve">O backlog é organizado por perfis (seção 4.2) e cenários (seção 4.3) e detalhado na Tabela 6 (seção 4.4). A priorização usa a técnica </w:t>
+      </w:r>
+      <w:proofErr w:type="spellStart"/>
+      <w:r>
+        <w:t>MoSCoW</w:t>
+      </w:r>
+      <w:proofErr w:type="spellEnd"/>
+      <w:r>
+        <w:t>, com o seguinte significado para este produto, a ser validado pelo P.O.:</w:t>
       </w:r>
     </w:p>
     <w:p>
@@ -13458,12 +13975,21 @@
         </w:numPr>
         <w:ind w:left="720"/>
       </w:pPr>
+      <w:proofErr w:type="spellStart"/>
       <w:r>
         <w:rPr>
           <w:b/>
           <w:bCs/>
         </w:rPr>
-        <w:t>Could:</w:t>
+        <w:t>Could</w:t>
+      </w:r>
+      <w:proofErr w:type="spellEnd"/>
+      <w:r>
+        <w:rPr>
+          <w:b/>
+          <w:bCs/>
+        </w:rPr>
+        <w:t>:</w:t>
       </w:r>
       <w:r>
         <w:t xml:space="preserve"> agrega conveniência; só é feito se sobrar capacidade e é o primeiro a sair no replanejamento.</w:t>
@@ -14614,6 +15140,14 @@
               </w:rPr>
               <w:t>ONG / Organização</w:t>
             </w:r>
+            <w:r>
+              <w:rPr>
+                <w:b/>
+                <w:bCs/>
+                <w:sz w:val="20"/>
+              </w:rPr>
+              <w:t xml:space="preserve"> / Responsável por Projetos Sociais</w:t>
+            </w:r>
           </w:p>
         </w:tc>
         <w:tc>
@@ -14812,6 +15346,7 @@
       </w:pPr>
       <w:bookmarkStart w:id="24" w:name="_Toc241664304"/>
       <w:r>
+        <w:lastRenderedPageBreak/>
         <w:t>Cenários</w:t>
       </w:r>
       <w:bookmarkEnd w:id="24"/>
@@ -14842,7 +15377,6 @@
           <w:sz w:val="20"/>
           <w:szCs w:val="20"/>
         </w:rPr>
-        <w:lastRenderedPageBreak/>
         <w:t xml:space="preserve">Tabela 5 – </w:t>
       </w:r>
       <w:r>
@@ -14907,6 +15441,7 @@
               </w:rPr>
               <w:t xml:space="preserve">Sistema: </w:t>
             </w:r>
+            <w:proofErr w:type="spellStart"/>
             <w:r>
               <w:rPr>
                 <w:b/>
@@ -14915,6 +15450,7 @@
               </w:rPr>
               <w:t>VolunJá</w:t>
             </w:r>
+            <w:proofErr w:type="spellEnd"/>
             <w:r>
               <w:rPr>
                 <w:b/>
@@ -15836,15 +16372,32 @@
       <w:r>
         <w:t xml:space="preserve"> formam o MVP e cobrem o caminho completo da questão-problema: a ONG publica a vaga (RF07), o voluntário a encontra por filtros (RF12), candidata-se com documentos (RF15 e RF16), é triado (RF18), recebe o comprovante (RF21) e é conectado ao responsável (RF20). As </w:t>
       </w:r>
+      <w:proofErr w:type="spellStart"/>
       <w:r>
         <w:rPr>
           <w:i/>
           <w:iCs/>
         </w:rPr>
-        <w:t>user stories</w:t>
-      </w:r>
-      <w:r>
-        <w:t xml:space="preserve"> seguem o formato "Eu, como &lt;perfil&gt;, quero &lt;ação&gt;, para &lt;benefício&gt;" e ficam registradas no backlog em markdown.</w:t>
+        <w:t>user</w:t>
+      </w:r>
+      <w:proofErr w:type="spellEnd"/>
+      <w:r>
+        <w:rPr>
+          <w:i/>
+          <w:iCs/>
+        </w:rPr>
+        <w:t xml:space="preserve"> stories</w:t>
+      </w:r>
+      <w:r>
+        <w:t xml:space="preserve"> seguem o formato "Eu, como &lt;perfil&gt;, quero &lt;ação&gt;, para &lt;benefício&gt;" e ficam registradas no backlog em </w:t>
+      </w:r>
+      <w:proofErr w:type="spellStart"/>
+      <w:r>
+        <w:t>markdown</w:t>
+      </w:r>
+      <w:proofErr w:type="spellEnd"/>
+      <w:r>
+        <w:t>.</w:t>
       </w:r>
     </w:p>
     <w:p>
@@ -15904,7 +16457,7 @@
         </w:trPr>
         <w:tc>
           <w:tcPr>
-            <w:tcW w:w="13956" w:type="dxa"/>
+            <w:tcW w:w="13957" w:type="dxa"/>
             <w:gridSpan w:val="7"/>
             <w:tcBorders>
               <w:top w:val="single" w:sz="4" w:space="0" w:color="000000"/>
@@ -15936,6 +16489,7 @@
               </w:rPr>
               <w:t xml:space="preserve">Sistema: </w:t>
             </w:r>
+            <w:proofErr w:type="spellStart"/>
             <w:r>
               <w:rPr>
                 <w:b/>
@@ -15945,6 +16499,7 @@
               </w:rPr>
               <w:t>VolunJá</w:t>
             </w:r>
+            <w:proofErr w:type="spellEnd"/>
             <w:r>
               <w:rPr>
                 <w:b/>
@@ -15964,7 +16519,7 @@
         </w:trPr>
         <w:tc>
           <w:tcPr>
-            <w:tcW w:w="1250" w:type="dxa"/>
+            <w:tcW w:w="1251" w:type="dxa"/>
             <w:tcBorders>
               <w:top w:val="single" w:sz="4" w:space="0" w:color="000000"/>
               <w:left w:val="single" w:sz="4" w:space="0" w:color="000000"/>
@@ -16133,7 +16688,27 @@
                 <w:sz w:val="18"/>
                 <w:szCs w:val="18"/>
               </w:rPr>
-              <w:t>Priorização (Must, Should, Could)</w:t>
+              <w:t xml:space="preserve">Priorização (Must, Should, </w:t>
+            </w:r>
+            <w:proofErr w:type="spellStart"/>
+            <w:r>
+              <w:rPr>
+                <w:b/>
+                <w:bCs/>
+                <w:sz w:val="18"/>
+                <w:szCs w:val="18"/>
+              </w:rPr>
+              <w:t>Could</w:t>
+            </w:r>
+            <w:proofErr w:type="spellEnd"/>
+            <w:r>
+              <w:rPr>
+                <w:b/>
+                <w:bCs/>
+                <w:sz w:val="18"/>
+                <w:szCs w:val="18"/>
+              </w:rPr>
+              <w:t>)</w:t>
             </w:r>
           </w:p>
         </w:tc>
@@ -16196,6 +16771,7 @@
                 <w:szCs w:val="18"/>
               </w:rPr>
             </w:pPr>
+            <w:proofErr w:type="spellStart"/>
             <w:r>
               <w:rPr>
                 <w:b/>
@@ -16205,7 +16781,19 @@
                 <w:sz w:val="18"/>
                 <w:szCs w:val="18"/>
               </w:rPr>
-              <w:t>User stories</w:t>
+              <w:t>User</w:t>
+            </w:r>
+            <w:proofErr w:type="spellEnd"/>
+            <w:r>
+              <w:rPr>
+                <w:b/>
+                <w:bCs/>
+                <w:i/>
+                <w:iCs/>
+                <w:sz w:val="18"/>
+                <w:szCs w:val="18"/>
+              </w:rPr>
+              <w:t xml:space="preserve"> stories</w:t>
             </w:r>
             <w:r>
               <w:rPr>
@@ -16225,7 +16813,7 @@
         </w:trPr>
         <w:tc>
           <w:tcPr>
-            <w:tcW w:w="1250" w:type="dxa"/>
+            <w:tcW w:w="1251" w:type="dxa"/>
             <w:tcBorders>
               <w:top w:val="single" w:sz="4" w:space="0" w:color="000000"/>
               <w:left w:val="single" w:sz="4" w:space="0" w:color="000000"/>
@@ -16387,7 +16975,21 @@
                 <w:sz w:val="18"/>
                 <w:szCs w:val="18"/>
               </w:rPr>
-              <w:t>Criar conta de pessoa física com nome, e-mail, senha, localização e contato.</w:t>
+              <w:t>Criar conta de pessoa física com nome, e-mail, senha</w:t>
+            </w:r>
+            <w:r>
+              <w:rPr>
+                <w:sz w:val="18"/>
+                <w:szCs w:val="18"/>
+              </w:rPr>
+              <w:t>, CPF</w:t>
+            </w:r>
+            <w:r>
+              <w:rPr>
+                <w:sz w:val="18"/>
+                <w:szCs w:val="18"/>
+              </w:rPr>
+              <w:t>, localização e contato.</w:t>
             </w:r>
           </w:p>
         </w:tc>
@@ -16426,7 +17028,7 @@
         </w:trPr>
         <w:tc>
           <w:tcPr>
-            <w:tcW w:w="1250" w:type="dxa"/>
+            <w:tcW w:w="1251" w:type="dxa"/>
             <w:tcBorders>
               <w:top w:val="single" w:sz="4" w:space="0" w:color="000000"/>
               <w:left w:val="single" w:sz="4" w:space="0" w:color="000000"/>
@@ -16620,7 +17222,7 @@
         </w:trPr>
         <w:tc>
           <w:tcPr>
-            <w:tcW w:w="1250" w:type="dxa"/>
+            <w:tcW w:w="1251" w:type="dxa"/>
             <w:tcBorders>
               <w:top w:val="single" w:sz="4" w:space="0" w:color="000000"/>
               <w:left w:val="single" w:sz="4" w:space="0" w:color="000000"/>
@@ -16695,7 +17297,7 @@
                 <w:sz w:val="18"/>
                 <w:szCs w:val="18"/>
               </w:rPr>
-              <w:t>Autenticação de usuários</w:t>
+              <w:t>Cadastro de Projeto Social</w:t>
             </w:r>
           </w:p>
         </w:tc>
@@ -16744,13 +17346,15 @@
                 <w:szCs w:val="18"/>
               </w:rPr>
             </w:pPr>
-            <w:r>
-              <w:rPr>
-                <w:sz w:val="18"/>
-                <w:szCs w:val="18"/>
-              </w:rPr>
-              <w:t>Must</w:t>
-            </w:r>
+            <w:proofErr w:type="spellStart"/>
+            <w:r>
+              <w:rPr>
+                <w:sz w:val="18"/>
+                <w:szCs w:val="18"/>
+              </w:rPr>
+              <w:t>Could</w:t>
+            </w:r>
+            <w:proofErr w:type="spellEnd"/>
           </w:p>
         </w:tc>
         <w:tc>
@@ -16776,7 +17380,7 @@
                 <w:sz w:val="18"/>
                 <w:szCs w:val="18"/>
               </w:rPr>
-              <w:t>Entrar e sair com e-mail e senha, direcionando o usuário conforme seu perfil.</w:t>
+              <w:t>Criar conta de um responsável por um projeto social. Com campos de nome, CPF, e-mail, localização, área de atuação, causa e endereço responsável</w:t>
             </w:r>
           </w:p>
         </w:tc>
@@ -16814,28 +17418,35 @@
         </w:trPr>
         <w:tc>
           <w:tcPr>
-            <w:tcW w:w="1250" w:type="dxa"/>
-            <w:tcBorders>
-              <w:top w:val="single" w:sz="4" w:space="0" w:color="000000"/>
-              <w:left w:val="single" w:sz="4" w:space="0" w:color="000000"/>
-              <w:bottom w:val="single" w:sz="4" w:space="0" w:color="000000"/>
-              <w:right w:val="single" w:sz="4" w:space="0" w:color="000000"/>
-            </w:tcBorders>
-          </w:tcPr>
-          <w:p>
-            <w:pPr>
-              <w:spacing w:before="20" w:after="20"/>
-              <w:rPr>
-                <w:sz w:val="18"/>
-                <w:szCs w:val="18"/>
-              </w:rPr>
-            </w:pPr>
-            <w:r>
-              <w:rPr>
-                <w:sz w:val="18"/>
-                <w:szCs w:val="18"/>
-              </w:rPr>
-              <w:t>CN01-RF04</w:t>
+            <w:tcW w:w="1251" w:type="dxa"/>
+            <w:tcBorders>
+              <w:top w:val="single" w:sz="4" w:space="0" w:color="000000"/>
+              <w:left w:val="single" w:sz="4" w:space="0" w:color="000000"/>
+              <w:bottom w:val="single" w:sz="4" w:space="0" w:color="000000"/>
+              <w:right w:val="single" w:sz="4" w:space="0" w:color="000000"/>
+            </w:tcBorders>
+          </w:tcPr>
+          <w:p>
+            <w:pPr>
+              <w:spacing w:before="20" w:after="20"/>
+              <w:rPr>
+                <w:sz w:val="18"/>
+                <w:szCs w:val="18"/>
+              </w:rPr>
+            </w:pPr>
+            <w:r>
+              <w:rPr>
+                <w:sz w:val="18"/>
+                <w:szCs w:val="18"/>
+              </w:rPr>
+              <w:t>CN01-RF0</w:t>
+            </w:r>
+            <w:r>
+              <w:rPr>
+                <w:sz w:val="18"/>
+                <w:szCs w:val="18"/>
+              </w:rPr>
+              <w:t>4</w:t>
             </w:r>
           </w:p>
         </w:tc>
@@ -16862,7 +17473,7 @@
                 <w:sz w:val="18"/>
                 <w:szCs w:val="18"/>
               </w:rPr>
-              <w:t>A definir</w:t>
+              <w:t>6</w:t>
             </w:r>
           </w:p>
         </w:tc>
@@ -16889,7 +17500,7 @@
                 <w:sz w:val="18"/>
                 <w:szCs w:val="18"/>
               </w:rPr>
-              <w:t>Recuperação de senha</w:t>
+              <w:t>Autenticação de usuários</w:t>
             </w:r>
           </w:p>
         </w:tc>
@@ -16943,7 +17554,7 @@
                 <w:sz w:val="18"/>
                 <w:szCs w:val="18"/>
               </w:rPr>
-              <w:t>Should</w:t>
+              <w:t>Must</w:t>
             </w:r>
           </w:p>
         </w:tc>
@@ -16970,7 +17581,7 @@
                 <w:sz w:val="18"/>
                 <w:szCs w:val="18"/>
               </w:rPr>
-              <w:t>Redefinir a senha por link enviado ao e-mail cadastrado.</w:t>
+              <w:t>Entrar e sair com e-mail e senha, direcionando o usuário conforme seu perfil.</w:t>
             </w:r>
           </w:p>
         </w:tc>
@@ -16997,7 +17608,14 @@
                 <w:sz w:val="18"/>
                 <w:szCs w:val="18"/>
               </w:rPr>
-              <w:t>US04</w:t>
+              <w:t>US0</w:t>
+            </w:r>
+            <w:r>
+              <w:rPr>
+                <w:sz w:val="18"/>
+                <w:szCs w:val="18"/>
+              </w:rPr>
+              <w:t>4</w:t>
             </w:r>
           </w:p>
         </w:tc>
@@ -17008,28 +17626,35 @@
         </w:trPr>
         <w:tc>
           <w:tcPr>
-            <w:tcW w:w="1250" w:type="dxa"/>
-            <w:tcBorders>
-              <w:top w:val="single" w:sz="4" w:space="0" w:color="000000"/>
-              <w:left w:val="single" w:sz="4" w:space="0" w:color="000000"/>
-              <w:bottom w:val="single" w:sz="4" w:space="0" w:color="000000"/>
-              <w:right w:val="single" w:sz="4" w:space="0" w:color="000000"/>
-            </w:tcBorders>
-          </w:tcPr>
-          <w:p>
-            <w:pPr>
-              <w:spacing w:before="20" w:after="20"/>
-              <w:rPr>
-                <w:sz w:val="18"/>
-                <w:szCs w:val="18"/>
-              </w:rPr>
-            </w:pPr>
-            <w:r>
-              <w:rPr>
-                <w:sz w:val="18"/>
-                <w:szCs w:val="18"/>
-              </w:rPr>
-              <w:t>CN02-RF05</w:t>
+            <w:tcW w:w="1251" w:type="dxa"/>
+            <w:tcBorders>
+              <w:top w:val="single" w:sz="4" w:space="0" w:color="000000"/>
+              <w:left w:val="single" w:sz="4" w:space="0" w:color="000000"/>
+              <w:bottom w:val="single" w:sz="4" w:space="0" w:color="000000"/>
+              <w:right w:val="single" w:sz="4" w:space="0" w:color="000000"/>
+            </w:tcBorders>
+          </w:tcPr>
+          <w:p>
+            <w:pPr>
+              <w:spacing w:before="20" w:after="20"/>
+              <w:rPr>
+                <w:sz w:val="18"/>
+                <w:szCs w:val="18"/>
+              </w:rPr>
+            </w:pPr>
+            <w:r>
+              <w:rPr>
+                <w:sz w:val="18"/>
+                <w:szCs w:val="18"/>
+              </w:rPr>
+              <w:t>CN01-RF0</w:t>
+            </w:r>
+            <w:r>
+              <w:rPr>
+                <w:sz w:val="18"/>
+                <w:szCs w:val="18"/>
+              </w:rPr>
+              <w:t>5</w:t>
             </w:r>
           </w:p>
         </w:tc>
@@ -17056,7 +17681,7 @@
                 <w:sz w:val="18"/>
                 <w:szCs w:val="18"/>
               </w:rPr>
-              <w:t>7</w:t>
+              <w:t>A definir</w:t>
             </w:r>
           </w:p>
         </w:tc>
@@ -17083,7 +17708,7 @@
                 <w:sz w:val="18"/>
                 <w:szCs w:val="18"/>
               </w:rPr>
-              <w:t>Manter perfil do voluntário</w:t>
+              <w:t>Recuperação de senha</w:t>
             </w:r>
           </w:p>
         </w:tc>
@@ -17137,7 +17762,7 @@
                 <w:sz w:val="18"/>
                 <w:szCs w:val="18"/>
               </w:rPr>
-              <w:t>Must</w:t>
+              <w:t>Should</w:t>
             </w:r>
           </w:p>
         </w:tc>
@@ -17164,7 +17789,7 @@
                 <w:sz w:val="18"/>
                 <w:szCs w:val="18"/>
               </w:rPr>
-              <w:t>Editar dados pessoais, áreas de interesse e disponibilidade (dias, período e carga horária).</w:t>
+              <w:t>Redefinir a senha por link enviado ao e-mail cadastrado.</w:t>
             </w:r>
           </w:p>
         </w:tc>
@@ -17191,7 +17816,14 @@
                 <w:sz w:val="18"/>
                 <w:szCs w:val="18"/>
               </w:rPr>
-              <w:t>US05</w:t>
+              <w:t>US0</w:t>
+            </w:r>
+            <w:r>
+              <w:rPr>
+                <w:sz w:val="18"/>
+                <w:szCs w:val="18"/>
+              </w:rPr>
+              <w:t>5</w:t>
             </w:r>
           </w:p>
         </w:tc>
@@ -17202,28 +17834,35 @@
         </w:trPr>
         <w:tc>
           <w:tcPr>
-            <w:tcW w:w="1250" w:type="dxa"/>
-            <w:tcBorders>
-              <w:top w:val="single" w:sz="4" w:space="0" w:color="000000"/>
-              <w:left w:val="single" w:sz="4" w:space="0" w:color="000000"/>
-              <w:bottom w:val="single" w:sz="4" w:space="0" w:color="000000"/>
-              <w:right w:val="single" w:sz="4" w:space="0" w:color="000000"/>
-            </w:tcBorders>
-          </w:tcPr>
-          <w:p>
-            <w:pPr>
-              <w:spacing w:before="20" w:after="20"/>
-              <w:rPr>
-                <w:sz w:val="18"/>
-                <w:szCs w:val="18"/>
-              </w:rPr>
-            </w:pPr>
-            <w:r>
-              <w:rPr>
-                <w:sz w:val="18"/>
-                <w:szCs w:val="18"/>
-              </w:rPr>
-              <w:t>CN03-RF06</w:t>
+            <w:tcW w:w="1251" w:type="dxa"/>
+            <w:tcBorders>
+              <w:top w:val="single" w:sz="4" w:space="0" w:color="000000"/>
+              <w:left w:val="single" w:sz="4" w:space="0" w:color="000000"/>
+              <w:bottom w:val="single" w:sz="4" w:space="0" w:color="000000"/>
+              <w:right w:val="single" w:sz="4" w:space="0" w:color="000000"/>
+            </w:tcBorders>
+          </w:tcPr>
+          <w:p>
+            <w:pPr>
+              <w:spacing w:before="20" w:after="20"/>
+              <w:rPr>
+                <w:sz w:val="18"/>
+                <w:szCs w:val="18"/>
+              </w:rPr>
+            </w:pPr>
+            <w:r>
+              <w:rPr>
+                <w:sz w:val="18"/>
+                <w:szCs w:val="18"/>
+              </w:rPr>
+              <w:t>CN02-RF0</w:t>
+            </w:r>
+            <w:r>
+              <w:rPr>
+                <w:sz w:val="18"/>
+                <w:szCs w:val="18"/>
+              </w:rPr>
+              <w:t>6</w:t>
             </w:r>
           </w:p>
         </w:tc>
@@ -17277,7 +17916,7 @@
                 <w:sz w:val="18"/>
                 <w:szCs w:val="18"/>
               </w:rPr>
-              <w:t>Manter perfil da organização</w:t>
+              <w:t>Manter perfil do voluntário</w:t>
             </w:r>
           </w:p>
         </w:tc>
@@ -17358,7 +17997,7 @@
                 <w:sz w:val="18"/>
                 <w:szCs w:val="18"/>
               </w:rPr>
-              <w:t>Editar os dados institucionais, a descrição da ONG e os canais de contato.</w:t>
+              <w:t>Editar dados pessoais, áreas de interesse e disponibilidade (dias, período e carga horária).</w:t>
             </w:r>
           </w:p>
         </w:tc>
@@ -17385,7 +18024,14 @@
                 <w:sz w:val="18"/>
                 <w:szCs w:val="18"/>
               </w:rPr>
-              <w:t>US06</w:t>
+              <w:t>US0</w:t>
+            </w:r>
+            <w:r>
+              <w:rPr>
+                <w:sz w:val="18"/>
+                <w:szCs w:val="18"/>
+              </w:rPr>
+              <w:t>6</w:t>
             </w:r>
           </w:p>
         </w:tc>
@@ -17396,28 +18042,35 @@
         </w:trPr>
         <w:tc>
           <w:tcPr>
-            <w:tcW w:w="1250" w:type="dxa"/>
-            <w:tcBorders>
-              <w:top w:val="single" w:sz="4" w:space="0" w:color="000000"/>
-              <w:left w:val="single" w:sz="4" w:space="0" w:color="000000"/>
-              <w:bottom w:val="single" w:sz="4" w:space="0" w:color="000000"/>
-              <w:right w:val="single" w:sz="4" w:space="0" w:color="000000"/>
-            </w:tcBorders>
-          </w:tcPr>
-          <w:p>
-            <w:pPr>
-              <w:spacing w:before="20" w:after="20"/>
-              <w:rPr>
-                <w:sz w:val="18"/>
-                <w:szCs w:val="18"/>
-              </w:rPr>
-            </w:pPr>
-            <w:r>
-              <w:rPr>
-                <w:sz w:val="18"/>
-                <w:szCs w:val="18"/>
-              </w:rPr>
-              <w:t>CN04-RF07</w:t>
+            <w:tcW w:w="1251" w:type="dxa"/>
+            <w:tcBorders>
+              <w:top w:val="single" w:sz="4" w:space="0" w:color="000000"/>
+              <w:left w:val="single" w:sz="4" w:space="0" w:color="000000"/>
+              <w:bottom w:val="single" w:sz="4" w:space="0" w:color="000000"/>
+              <w:right w:val="single" w:sz="4" w:space="0" w:color="000000"/>
+            </w:tcBorders>
+          </w:tcPr>
+          <w:p>
+            <w:pPr>
+              <w:spacing w:before="20" w:after="20"/>
+              <w:rPr>
+                <w:sz w:val="18"/>
+                <w:szCs w:val="18"/>
+              </w:rPr>
+            </w:pPr>
+            <w:r>
+              <w:rPr>
+                <w:sz w:val="18"/>
+                <w:szCs w:val="18"/>
+              </w:rPr>
+              <w:t>CN03-RF0</w:t>
+            </w:r>
+            <w:r>
+              <w:rPr>
+                <w:sz w:val="18"/>
+                <w:szCs w:val="18"/>
+              </w:rPr>
+              <w:t>7</w:t>
             </w:r>
           </w:p>
         </w:tc>
@@ -17444,7 +18097,7 @@
                 <w:sz w:val="18"/>
                 <w:szCs w:val="18"/>
               </w:rPr>
-              <w:t>8</w:t>
+              <w:t>7</w:t>
             </w:r>
           </w:p>
         </w:tc>
@@ -17471,7 +18124,7 @@
                 <w:sz w:val="18"/>
                 <w:szCs w:val="18"/>
               </w:rPr>
-              <w:t>Cadastrar vaga de voluntariado</w:t>
+              <w:t>Manter perfil da organização</w:t>
             </w:r>
           </w:p>
         </w:tc>
@@ -17552,7 +18205,7 @@
                 <w:sz w:val="18"/>
                 <w:szCs w:val="18"/>
               </w:rPr>
-              <w:t>Publicar vaga com os campos padronizados: descrição, atividades, causa, modalidade, local, carga horária, período e nº de vagas.</w:t>
+              <w:t>Editar os dados institucionais, a descrição da ONG e os canais de contato.</w:t>
             </w:r>
           </w:p>
         </w:tc>
@@ -17579,7 +18232,14 @@
                 <w:sz w:val="18"/>
                 <w:szCs w:val="18"/>
               </w:rPr>
-              <w:t>US07</w:t>
+              <w:t>US0</w:t>
+            </w:r>
+            <w:r>
+              <w:rPr>
+                <w:sz w:val="18"/>
+                <w:szCs w:val="18"/>
+              </w:rPr>
+              <w:t>7</w:t>
             </w:r>
           </w:p>
         </w:tc>
@@ -17590,28 +18250,35 @@
         </w:trPr>
         <w:tc>
           <w:tcPr>
-            <w:tcW w:w="1250" w:type="dxa"/>
-            <w:tcBorders>
-              <w:top w:val="single" w:sz="4" w:space="0" w:color="000000"/>
-              <w:left w:val="single" w:sz="4" w:space="0" w:color="000000"/>
-              <w:bottom w:val="single" w:sz="4" w:space="0" w:color="000000"/>
-              <w:right w:val="single" w:sz="4" w:space="0" w:color="000000"/>
-            </w:tcBorders>
-          </w:tcPr>
-          <w:p>
-            <w:pPr>
-              <w:spacing w:before="20" w:after="20"/>
-              <w:rPr>
-                <w:sz w:val="18"/>
-                <w:szCs w:val="18"/>
-              </w:rPr>
-            </w:pPr>
-            <w:r>
-              <w:rPr>
-                <w:sz w:val="18"/>
-                <w:szCs w:val="18"/>
-              </w:rPr>
-              <w:t>CN04-RF08</w:t>
+            <w:tcW w:w="1251" w:type="dxa"/>
+            <w:tcBorders>
+              <w:top w:val="single" w:sz="4" w:space="0" w:color="000000"/>
+              <w:left w:val="single" w:sz="4" w:space="0" w:color="000000"/>
+              <w:bottom w:val="single" w:sz="4" w:space="0" w:color="000000"/>
+              <w:right w:val="single" w:sz="4" w:space="0" w:color="000000"/>
+            </w:tcBorders>
+          </w:tcPr>
+          <w:p>
+            <w:pPr>
+              <w:spacing w:before="20" w:after="20"/>
+              <w:rPr>
+                <w:sz w:val="18"/>
+                <w:szCs w:val="18"/>
+              </w:rPr>
+            </w:pPr>
+            <w:r>
+              <w:rPr>
+                <w:sz w:val="18"/>
+                <w:szCs w:val="18"/>
+              </w:rPr>
+              <w:t>CN04-RF0</w:t>
+            </w:r>
+            <w:r>
+              <w:rPr>
+                <w:sz w:val="18"/>
+                <w:szCs w:val="18"/>
+              </w:rPr>
+              <w:t>8</w:t>
             </w:r>
           </w:p>
         </w:tc>
@@ -17665,7 +18332,7 @@
                 <w:sz w:val="18"/>
                 <w:szCs w:val="18"/>
               </w:rPr>
-              <w:t>Editar e encerrar vaga</w:t>
+              <w:t>Cadastrar vaga de voluntariado</w:t>
             </w:r>
           </w:p>
         </w:tc>
@@ -17746,7 +18413,7 @@
                 <w:sz w:val="18"/>
                 <w:szCs w:val="18"/>
               </w:rPr>
-              <w:t>Alterar os dados de uma vaga publicada e encerrá-la quando preenchida ou cancelada.</w:t>
+              <w:t>Publicar vaga com os campos padronizados: descrição, atividades, causa, modalidade, local, carga horária, período e nº de vagas.</w:t>
             </w:r>
           </w:p>
         </w:tc>
@@ -17773,7 +18440,14 @@
                 <w:sz w:val="18"/>
                 <w:szCs w:val="18"/>
               </w:rPr>
-              <w:t>US08</w:t>
+              <w:t>US0</w:t>
+            </w:r>
+            <w:r>
+              <w:rPr>
+                <w:sz w:val="18"/>
+                <w:szCs w:val="18"/>
+              </w:rPr>
+              <w:t>8</w:t>
             </w:r>
           </w:p>
         </w:tc>
@@ -17784,28 +18458,35 @@
         </w:trPr>
         <w:tc>
           <w:tcPr>
-            <w:tcW w:w="1250" w:type="dxa"/>
-            <w:tcBorders>
-              <w:top w:val="single" w:sz="4" w:space="0" w:color="000000"/>
-              <w:left w:val="single" w:sz="4" w:space="0" w:color="000000"/>
-              <w:bottom w:val="single" w:sz="4" w:space="0" w:color="000000"/>
-              <w:right w:val="single" w:sz="4" w:space="0" w:color="000000"/>
-            </w:tcBorders>
-          </w:tcPr>
-          <w:p>
-            <w:pPr>
-              <w:spacing w:before="20" w:after="20"/>
-              <w:rPr>
-                <w:sz w:val="18"/>
-                <w:szCs w:val="18"/>
-              </w:rPr>
-            </w:pPr>
-            <w:r>
-              <w:rPr>
-                <w:sz w:val="18"/>
-                <w:szCs w:val="18"/>
-              </w:rPr>
-              <w:t>CN04-RF09</w:t>
+            <w:tcW w:w="1251" w:type="dxa"/>
+            <w:tcBorders>
+              <w:top w:val="single" w:sz="4" w:space="0" w:color="000000"/>
+              <w:left w:val="single" w:sz="4" w:space="0" w:color="000000"/>
+              <w:bottom w:val="single" w:sz="4" w:space="0" w:color="000000"/>
+              <w:right w:val="single" w:sz="4" w:space="0" w:color="000000"/>
+            </w:tcBorders>
+          </w:tcPr>
+          <w:p>
+            <w:pPr>
+              <w:spacing w:before="20" w:after="20"/>
+              <w:rPr>
+                <w:sz w:val="18"/>
+                <w:szCs w:val="18"/>
+              </w:rPr>
+            </w:pPr>
+            <w:r>
+              <w:rPr>
+                <w:sz w:val="18"/>
+                <w:szCs w:val="18"/>
+              </w:rPr>
+              <w:t>CN04-RF0</w:t>
+            </w:r>
+            <w:r>
+              <w:rPr>
+                <w:sz w:val="18"/>
+                <w:szCs w:val="18"/>
+              </w:rPr>
+              <w:t>9</w:t>
             </w:r>
           </w:p>
         </w:tc>
@@ -17859,7 +18540,7 @@
                 <w:sz w:val="18"/>
                 <w:szCs w:val="18"/>
               </w:rPr>
-              <w:t>Listar vagas da organização</w:t>
+              <w:t>Editar e encerrar vaga</w:t>
             </w:r>
           </w:p>
         </w:tc>
@@ -17940,7 +18621,7 @@
                 <w:sz w:val="18"/>
                 <w:szCs w:val="18"/>
               </w:rPr>
-              <w:t>Painel da ONG com suas vagas, a situação de cada uma e o número de candidaturas.</w:t>
+              <w:t>Alterar os dados de uma vaga publicada e encerrá-la quando preenchida ou cancelada.</w:t>
             </w:r>
           </w:p>
         </w:tc>
@@ -17967,7 +18648,14 @@
                 <w:sz w:val="18"/>
                 <w:szCs w:val="18"/>
               </w:rPr>
-              <w:t>US09</w:t>
+              <w:t>US0</w:t>
+            </w:r>
+            <w:r>
+              <w:rPr>
+                <w:sz w:val="18"/>
+                <w:szCs w:val="18"/>
+              </w:rPr>
+              <w:t>9</w:t>
             </w:r>
           </w:p>
         </w:tc>
@@ -17978,28 +18666,35 @@
         </w:trPr>
         <w:tc>
           <w:tcPr>
-            <w:tcW w:w="1250" w:type="dxa"/>
-            <w:tcBorders>
-              <w:top w:val="single" w:sz="4" w:space="0" w:color="000000"/>
-              <w:left w:val="single" w:sz="4" w:space="0" w:color="000000"/>
-              <w:bottom w:val="single" w:sz="4" w:space="0" w:color="000000"/>
-              <w:right w:val="single" w:sz="4" w:space="0" w:color="000000"/>
-            </w:tcBorders>
-          </w:tcPr>
-          <w:p>
-            <w:pPr>
-              <w:spacing w:before="20" w:after="20"/>
-              <w:rPr>
-                <w:sz w:val="18"/>
-                <w:szCs w:val="18"/>
-              </w:rPr>
-            </w:pPr>
-            <w:r>
-              <w:rPr>
-                <w:sz w:val="18"/>
-                <w:szCs w:val="18"/>
-              </w:rPr>
-              <w:t>CN04-RF10</w:t>
+            <w:tcW w:w="1251" w:type="dxa"/>
+            <w:tcBorders>
+              <w:top w:val="single" w:sz="4" w:space="0" w:color="000000"/>
+              <w:left w:val="single" w:sz="4" w:space="0" w:color="000000"/>
+              <w:bottom w:val="single" w:sz="4" w:space="0" w:color="000000"/>
+              <w:right w:val="single" w:sz="4" w:space="0" w:color="000000"/>
+            </w:tcBorders>
+          </w:tcPr>
+          <w:p>
+            <w:pPr>
+              <w:spacing w:before="20" w:after="20"/>
+              <w:rPr>
+                <w:sz w:val="18"/>
+                <w:szCs w:val="18"/>
+              </w:rPr>
+            </w:pPr>
+            <w:r>
+              <w:rPr>
+                <w:sz w:val="18"/>
+                <w:szCs w:val="18"/>
+              </w:rPr>
+              <w:t>CN04-RF</w:t>
+            </w:r>
+            <w:r>
+              <w:rPr>
+                <w:sz w:val="18"/>
+                <w:szCs w:val="18"/>
+              </w:rPr>
+              <w:t>10</w:t>
             </w:r>
           </w:p>
         </w:tc>
@@ -18026,7 +18721,7 @@
                 <w:sz w:val="18"/>
                 <w:szCs w:val="18"/>
               </w:rPr>
-              <w:t>A definir</w:t>
+              <w:t>8</w:t>
             </w:r>
           </w:p>
         </w:tc>
@@ -18053,7 +18748,7 @@
                 <w:sz w:val="18"/>
                 <w:szCs w:val="18"/>
               </w:rPr>
-              <w:t>Definir documentação exigida</w:t>
+              <w:t>Listar vagas da organização</w:t>
             </w:r>
           </w:p>
         </w:tc>
@@ -18107,7 +18802,7 @@
                 <w:sz w:val="18"/>
                 <w:szCs w:val="18"/>
               </w:rPr>
-              <w:t>Should</w:t>
+              <w:t>Must</w:t>
             </w:r>
           </w:p>
         </w:tc>
@@ -18134,7 +18829,7 @@
                 <w:sz w:val="18"/>
                 <w:szCs w:val="18"/>
               </w:rPr>
-              <w:t>Indicar os documentos que o voluntário deve enviar ao se candidatar.</w:t>
+              <w:t>Painel da ONG com suas vagas, a situação de cada uma e o número de candidaturas.</w:t>
             </w:r>
           </w:p>
         </w:tc>
@@ -18161,7 +18856,14 @@
                 <w:sz w:val="18"/>
                 <w:szCs w:val="18"/>
               </w:rPr>
-              <w:t>US10</w:t>
+              <w:t>US</w:t>
+            </w:r>
+            <w:r>
+              <w:rPr>
+                <w:sz w:val="18"/>
+                <w:szCs w:val="18"/>
+              </w:rPr>
+              <w:t>10</w:t>
             </w:r>
           </w:p>
         </w:tc>
@@ -18172,28 +18874,35 @@
         </w:trPr>
         <w:tc>
           <w:tcPr>
-            <w:tcW w:w="1250" w:type="dxa"/>
-            <w:tcBorders>
-              <w:top w:val="single" w:sz="4" w:space="0" w:color="000000"/>
-              <w:left w:val="single" w:sz="4" w:space="0" w:color="000000"/>
-              <w:bottom w:val="single" w:sz="4" w:space="0" w:color="000000"/>
-              <w:right w:val="single" w:sz="4" w:space="0" w:color="000000"/>
-            </w:tcBorders>
-          </w:tcPr>
-          <w:p>
-            <w:pPr>
-              <w:spacing w:before="20" w:after="20"/>
-              <w:rPr>
-                <w:sz w:val="18"/>
-                <w:szCs w:val="18"/>
-              </w:rPr>
-            </w:pPr>
-            <w:r>
-              <w:rPr>
-                <w:sz w:val="18"/>
-                <w:szCs w:val="18"/>
-              </w:rPr>
-              <w:t>CN05-RF11</w:t>
+            <w:tcW w:w="1251" w:type="dxa"/>
+            <w:tcBorders>
+              <w:top w:val="single" w:sz="4" w:space="0" w:color="000000"/>
+              <w:left w:val="single" w:sz="4" w:space="0" w:color="000000"/>
+              <w:bottom w:val="single" w:sz="4" w:space="0" w:color="000000"/>
+              <w:right w:val="single" w:sz="4" w:space="0" w:color="000000"/>
+            </w:tcBorders>
+          </w:tcPr>
+          <w:p>
+            <w:pPr>
+              <w:spacing w:before="20" w:after="20"/>
+              <w:rPr>
+                <w:sz w:val="18"/>
+                <w:szCs w:val="18"/>
+              </w:rPr>
+            </w:pPr>
+            <w:r>
+              <w:rPr>
+                <w:sz w:val="18"/>
+                <w:szCs w:val="18"/>
+              </w:rPr>
+              <w:t>CN04-RF1</w:t>
+            </w:r>
+            <w:r>
+              <w:rPr>
+                <w:sz w:val="18"/>
+                <w:szCs w:val="18"/>
+              </w:rPr>
+              <w:t>1</w:t>
             </w:r>
           </w:p>
         </w:tc>
@@ -18247,7 +18956,7 @@
                 <w:sz w:val="18"/>
                 <w:szCs w:val="18"/>
               </w:rPr>
-              <w:t>Listar vagas disponíveis</w:t>
+              <w:t>Definir documentação exigida</w:t>
             </w:r>
           </w:p>
         </w:tc>
@@ -18301,7 +19010,7 @@
                 <w:sz w:val="18"/>
                 <w:szCs w:val="18"/>
               </w:rPr>
-              <w:t>Must</w:t>
+              <w:t>Should</w:t>
             </w:r>
           </w:p>
         </w:tc>
@@ -18328,7 +19037,7 @@
                 <w:sz w:val="18"/>
                 <w:szCs w:val="18"/>
               </w:rPr>
-              <w:t>Listar publicamente as vagas abertas, com suas informações essenciais.</w:t>
+              <w:t>Indicar os documentos que o voluntário deve enviar ao se candidatar.</w:t>
             </w:r>
           </w:p>
         </w:tc>
@@ -18355,7 +19064,14 @@
                 <w:sz w:val="18"/>
                 <w:szCs w:val="18"/>
               </w:rPr>
-              <w:t>US11</w:t>
+              <w:t>US1</w:t>
+            </w:r>
+            <w:r>
+              <w:rPr>
+                <w:sz w:val="18"/>
+                <w:szCs w:val="18"/>
+              </w:rPr>
+              <w:t>1</w:t>
             </w:r>
           </w:p>
         </w:tc>
@@ -18366,28 +19082,35 @@
         </w:trPr>
         <w:tc>
           <w:tcPr>
-            <w:tcW w:w="1250" w:type="dxa"/>
-            <w:tcBorders>
-              <w:top w:val="single" w:sz="4" w:space="0" w:color="000000"/>
-              <w:left w:val="single" w:sz="4" w:space="0" w:color="000000"/>
-              <w:bottom w:val="single" w:sz="4" w:space="0" w:color="000000"/>
-              <w:right w:val="single" w:sz="4" w:space="0" w:color="000000"/>
-            </w:tcBorders>
-          </w:tcPr>
-          <w:p>
-            <w:pPr>
-              <w:spacing w:before="20" w:after="20"/>
-              <w:rPr>
-                <w:sz w:val="18"/>
-                <w:szCs w:val="18"/>
-              </w:rPr>
-            </w:pPr>
-            <w:r>
-              <w:rPr>
-                <w:sz w:val="18"/>
-                <w:szCs w:val="18"/>
-              </w:rPr>
-              <w:t>CN05-RF12</w:t>
+            <w:tcW w:w="1251" w:type="dxa"/>
+            <w:tcBorders>
+              <w:top w:val="single" w:sz="4" w:space="0" w:color="000000"/>
+              <w:left w:val="single" w:sz="4" w:space="0" w:color="000000"/>
+              <w:bottom w:val="single" w:sz="4" w:space="0" w:color="000000"/>
+              <w:right w:val="single" w:sz="4" w:space="0" w:color="000000"/>
+            </w:tcBorders>
+          </w:tcPr>
+          <w:p>
+            <w:pPr>
+              <w:spacing w:before="20" w:after="20"/>
+              <w:rPr>
+                <w:sz w:val="18"/>
+                <w:szCs w:val="18"/>
+              </w:rPr>
+            </w:pPr>
+            <w:r>
+              <w:rPr>
+                <w:sz w:val="18"/>
+                <w:szCs w:val="18"/>
+              </w:rPr>
+              <w:t>CN05-RF1</w:t>
+            </w:r>
+            <w:r>
+              <w:rPr>
+                <w:sz w:val="18"/>
+                <w:szCs w:val="18"/>
+              </w:rPr>
+              <w:t>2</w:t>
             </w:r>
           </w:p>
         </w:tc>
@@ -18441,7 +19164,7 @@
                 <w:sz w:val="18"/>
                 <w:szCs w:val="18"/>
               </w:rPr>
-              <w:t>Buscar vagas por filtros</w:t>
+              <w:t>Listar vagas disponíveis</w:t>
             </w:r>
           </w:p>
         </w:tc>
@@ -18522,7 +19245,7 @@
                 <w:sz w:val="18"/>
                 <w:szCs w:val="18"/>
               </w:rPr>
-              <w:t>Filtrar vagas por área de atuação/causa, modalidade, local, carga horária e período.</w:t>
+              <w:t>Listar publicamente as vagas abertas, com suas informações essenciais.</w:t>
             </w:r>
           </w:p>
         </w:tc>
@@ -18549,7 +19272,14 @@
                 <w:sz w:val="18"/>
                 <w:szCs w:val="18"/>
               </w:rPr>
-              <w:t>US12</w:t>
+              <w:t>US1</w:t>
+            </w:r>
+            <w:r>
+              <w:rPr>
+                <w:sz w:val="18"/>
+                <w:szCs w:val="18"/>
+              </w:rPr>
+              <w:t>2</w:t>
             </w:r>
           </w:p>
         </w:tc>
@@ -18560,28 +19290,35 @@
         </w:trPr>
         <w:tc>
           <w:tcPr>
-            <w:tcW w:w="1250" w:type="dxa"/>
-            <w:tcBorders>
-              <w:top w:val="single" w:sz="4" w:space="0" w:color="000000"/>
-              <w:left w:val="single" w:sz="4" w:space="0" w:color="000000"/>
-              <w:bottom w:val="single" w:sz="4" w:space="0" w:color="000000"/>
-              <w:right w:val="single" w:sz="4" w:space="0" w:color="000000"/>
-            </w:tcBorders>
-          </w:tcPr>
-          <w:p>
-            <w:pPr>
-              <w:spacing w:before="20" w:after="20"/>
-              <w:rPr>
-                <w:sz w:val="18"/>
-                <w:szCs w:val="18"/>
-              </w:rPr>
-            </w:pPr>
-            <w:r>
-              <w:rPr>
-                <w:sz w:val="18"/>
-                <w:szCs w:val="18"/>
-              </w:rPr>
-              <w:t>CN05-RF13</w:t>
+            <w:tcW w:w="1251" w:type="dxa"/>
+            <w:tcBorders>
+              <w:top w:val="single" w:sz="4" w:space="0" w:color="000000"/>
+              <w:left w:val="single" w:sz="4" w:space="0" w:color="000000"/>
+              <w:bottom w:val="single" w:sz="4" w:space="0" w:color="000000"/>
+              <w:right w:val="single" w:sz="4" w:space="0" w:color="000000"/>
+            </w:tcBorders>
+          </w:tcPr>
+          <w:p>
+            <w:pPr>
+              <w:spacing w:before="20" w:after="20"/>
+              <w:rPr>
+                <w:sz w:val="18"/>
+                <w:szCs w:val="18"/>
+              </w:rPr>
+            </w:pPr>
+            <w:r>
+              <w:rPr>
+                <w:sz w:val="18"/>
+                <w:szCs w:val="18"/>
+              </w:rPr>
+              <w:t>CN05-RF1</w:t>
+            </w:r>
+            <w:r>
+              <w:rPr>
+                <w:sz w:val="18"/>
+                <w:szCs w:val="18"/>
+              </w:rPr>
+              <w:t>3</w:t>
             </w:r>
           </w:p>
         </w:tc>
@@ -18635,7 +19372,7 @@
                 <w:sz w:val="18"/>
                 <w:szCs w:val="18"/>
               </w:rPr>
-              <w:t>Visualizar detalhes da vaga</w:t>
+              <w:t>Buscar vagas por filtros</w:t>
             </w:r>
           </w:p>
         </w:tc>
@@ -18716,7 +19453,7 @@
                 <w:sz w:val="18"/>
                 <w:szCs w:val="18"/>
               </w:rPr>
-              <w:t>Exibir a página completa da vaga e os dados públicos da organização.</w:t>
+              <w:t>Filtrar vagas por área de atuação/causa, modalidade, local, carga horária e período.</w:t>
             </w:r>
           </w:p>
         </w:tc>
@@ -18743,7 +19480,14 @@
                 <w:sz w:val="18"/>
                 <w:szCs w:val="18"/>
               </w:rPr>
-              <w:t>US13</w:t>
+              <w:t>US1</w:t>
+            </w:r>
+            <w:r>
+              <w:rPr>
+                <w:sz w:val="18"/>
+                <w:szCs w:val="18"/>
+              </w:rPr>
+              <w:t>3</w:t>
             </w:r>
           </w:p>
         </w:tc>
@@ -18754,28 +19498,35 @@
         </w:trPr>
         <w:tc>
           <w:tcPr>
-            <w:tcW w:w="1250" w:type="dxa"/>
-            <w:tcBorders>
-              <w:top w:val="single" w:sz="4" w:space="0" w:color="000000"/>
-              <w:left w:val="single" w:sz="4" w:space="0" w:color="000000"/>
-              <w:bottom w:val="single" w:sz="4" w:space="0" w:color="000000"/>
-              <w:right w:val="single" w:sz="4" w:space="0" w:color="000000"/>
-            </w:tcBorders>
-          </w:tcPr>
-          <w:p>
-            <w:pPr>
-              <w:spacing w:before="20" w:after="20"/>
-              <w:rPr>
-                <w:sz w:val="18"/>
-                <w:szCs w:val="18"/>
-              </w:rPr>
-            </w:pPr>
-            <w:r>
-              <w:rPr>
-                <w:sz w:val="18"/>
-                <w:szCs w:val="18"/>
-              </w:rPr>
-              <w:t>CN05-RF14</w:t>
+            <w:tcW w:w="1251" w:type="dxa"/>
+            <w:tcBorders>
+              <w:top w:val="single" w:sz="4" w:space="0" w:color="000000"/>
+              <w:left w:val="single" w:sz="4" w:space="0" w:color="000000"/>
+              <w:bottom w:val="single" w:sz="4" w:space="0" w:color="000000"/>
+              <w:right w:val="single" w:sz="4" w:space="0" w:color="000000"/>
+            </w:tcBorders>
+          </w:tcPr>
+          <w:p>
+            <w:pPr>
+              <w:spacing w:before="20" w:after="20"/>
+              <w:rPr>
+                <w:sz w:val="18"/>
+                <w:szCs w:val="18"/>
+              </w:rPr>
+            </w:pPr>
+            <w:r>
+              <w:rPr>
+                <w:sz w:val="18"/>
+                <w:szCs w:val="18"/>
+              </w:rPr>
+              <w:t>CN05-RF1</w:t>
+            </w:r>
+            <w:r>
+              <w:rPr>
+                <w:sz w:val="18"/>
+                <w:szCs w:val="18"/>
+              </w:rPr>
+              <w:t>4</w:t>
             </w:r>
           </w:p>
         </w:tc>
@@ -18829,7 +19580,7 @@
                 <w:sz w:val="18"/>
                 <w:szCs w:val="18"/>
               </w:rPr>
-              <w:t>Recomendar vagas compatíveis</w:t>
+              <w:t>Visualizar detalhes da vaga</w:t>
             </w:r>
           </w:p>
         </w:tc>
@@ -18883,7 +19634,7 @@
                 <w:sz w:val="18"/>
                 <w:szCs w:val="18"/>
               </w:rPr>
-              <w:t>Could</w:t>
+              <w:t>Must</w:t>
             </w:r>
           </w:p>
         </w:tc>
@@ -18910,7 +19661,7 @@
                 <w:sz w:val="18"/>
                 <w:szCs w:val="18"/>
               </w:rPr>
-              <w:t>Sugerir vagas compatíveis com os interesses e a disponibilidade do voluntário.</w:t>
+              <w:t>Exibir a página completa da vaga e os dados públicos da organização.</w:t>
             </w:r>
           </w:p>
         </w:tc>
@@ -18937,7 +19688,14 @@
                 <w:sz w:val="18"/>
                 <w:szCs w:val="18"/>
               </w:rPr>
-              <w:t>US14</w:t>
+              <w:t>US1</w:t>
+            </w:r>
+            <w:r>
+              <w:rPr>
+                <w:sz w:val="18"/>
+                <w:szCs w:val="18"/>
+              </w:rPr>
+              <w:t>4</w:t>
             </w:r>
           </w:p>
         </w:tc>
@@ -18948,28 +19706,35 @@
         </w:trPr>
         <w:tc>
           <w:tcPr>
-            <w:tcW w:w="1250" w:type="dxa"/>
-            <w:tcBorders>
-              <w:top w:val="single" w:sz="4" w:space="0" w:color="000000"/>
-              <w:left w:val="single" w:sz="4" w:space="0" w:color="000000"/>
-              <w:bottom w:val="single" w:sz="4" w:space="0" w:color="000000"/>
-              <w:right w:val="single" w:sz="4" w:space="0" w:color="000000"/>
-            </w:tcBorders>
-          </w:tcPr>
-          <w:p>
-            <w:pPr>
-              <w:spacing w:before="20" w:after="20"/>
-              <w:rPr>
-                <w:sz w:val="18"/>
-                <w:szCs w:val="18"/>
-              </w:rPr>
-            </w:pPr>
-            <w:r>
-              <w:rPr>
-                <w:sz w:val="18"/>
-                <w:szCs w:val="18"/>
-              </w:rPr>
-              <w:t>CN06-RF15</w:t>
+            <w:tcW w:w="1251" w:type="dxa"/>
+            <w:tcBorders>
+              <w:top w:val="single" w:sz="4" w:space="0" w:color="000000"/>
+              <w:left w:val="single" w:sz="4" w:space="0" w:color="000000"/>
+              <w:bottom w:val="single" w:sz="4" w:space="0" w:color="000000"/>
+              <w:right w:val="single" w:sz="4" w:space="0" w:color="000000"/>
+            </w:tcBorders>
+          </w:tcPr>
+          <w:p>
+            <w:pPr>
+              <w:spacing w:before="20" w:after="20"/>
+              <w:rPr>
+                <w:sz w:val="18"/>
+                <w:szCs w:val="18"/>
+              </w:rPr>
+            </w:pPr>
+            <w:r>
+              <w:rPr>
+                <w:sz w:val="18"/>
+                <w:szCs w:val="18"/>
+              </w:rPr>
+              <w:t>CN05-RF1</w:t>
+            </w:r>
+            <w:r>
+              <w:rPr>
+                <w:sz w:val="18"/>
+                <w:szCs w:val="18"/>
+              </w:rPr>
+              <w:t>5</w:t>
             </w:r>
           </w:p>
         </w:tc>
@@ -19023,7 +19788,7 @@
                 <w:sz w:val="18"/>
                 <w:szCs w:val="18"/>
               </w:rPr>
-              <w:t>Candidatar-se a uma vaga</w:t>
+              <w:t>Recomendar vagas compatíveis</w:t>
             </w:r>
           </w:p>
         </w:tc>
@@ -19072,13 +19837,15 @@
                 <w:szCs w:val="18"/>
               </w:rPr>
             </w:pPr>
-            <w:r>
-              <w:rPr>
-                <w:sz w:val="18"/>
-                <w:szCs w:val="18"/>
-              </w:rPr>
-              <w:t>Must</w:t>
-            </w:r>
+            <w:proofErr w:type="spellStart"/>
+            <w:r>
+              <w:rPr>
+                <w:sz w:val="18"/>
+                <w:szCs w:val="18"/>
+              </w:rPr>
+              <w:t>Could</w:t>
+            </w:r>
+            <w:proofErr w:type="spellEnd"/>
           </w:p>
         </w:tc>
         <w:tc>
@@ -19104,7 +19871,7 @@
                 <w:sz w:val="18"/>
                 <w:szCs w:val="18"/>
               </w:rPr>
-              <w:t>Registrar o interesse do voluntário em uma vaga específica.</w:t>
+              <w:t>Sugerir vagas compatíveis com os interesses e a disponibilidade do voluntário.</w:t>
             </w:r>
           </w:p>
         </w:tc>
@@ -19131,7 +19898,14 @@
                 <w:sz w:val="18"/>
                 <w:szCs w:val="18"/>
               </w:rPr>
-              <w:t>US15</w:t>
+              <w:t>US1</w:t>
+            </w:r>
+            <w:r>
+              <w:rPr>
+                <w:sz w:val="18"/>
+                <w:szCs w:val="18"/>
+              </w:rPr>
+              <w:t>5</w:t>
             </w:r>
           </w:p>
         </w:tc>
@@ -19142,28 +19916,35 @@
         </w:trPr>
         <w:tc>
           <w:tcPr>
-            <w:tcW w:w="1250" w:type="dxa"/>
-            <w:tcBorders>
-              <w:top w:val="single" w:sz="4" w:space="0" w:color="000000"/>
-              <w:left w:val="single" w:sz="4" w:space="0" w:color="000000"/>
-              <w:bottom w:val="single" w:sz="4" w:space="0" w:color="000000"/>
-              <w:right w:val="single" w:sz="4" w:space="0" w:color="000000"/>
-            </w:tcBorders>
-          </w:tcPr>
-          <w:p>
-            <w:pPr>
-              <w:spacing w:before="20" w:after="20"/>
-              <w:rPr>
-                <w:sz w:val="18"/>
-                <w:szCs w:val="18"/>
-              </w:rPr>
-            </w:pPr>
-            <w:r>
-              <w:rPr>
-                <w:sz w:val="18"/>
-                <w:szCs w:val="18"/>
-              </w:rPr>
-              <w:t>CN06-RF16</w:t>
+            <w:tcW w:w="1251" w:type="dxa"/>
+            <w:tcBorders>
+              <w:top w:val="single" w:sz="4" w:space="0" w:color="000000"/>
+              <w:left w:val="single" w:sz="4" w:space="0" w:color="000000"/>
+              <w:bottom w:val="single" w:sz="4" w:space="0" w:color="000000"/>
+              <w:right w:val="single" w:sz="4" w:space="0" w:color="000000"/>
+            </w:tcBorders>
+          </w:tcPr>
+          <w:p>
+            <w:pPr>
+              <w:spacing w:before="20" w:after="20"/>
+              <w:rPr>
+                <w:sz w:val="18"/>
+                <w:szCs w:val="18"/>
+              </w:rPr>
+            </w:pPr>
+            <w:r>
+              <w:rPr>
+                <w:sz w:val="18"/>
+                <w:szCs w:val="18"/>
+              </w:rPr>
+              <w:t>CN06-RF1</w:t>
+            </w:r>
+            <w:r>
+              <w:rPr>
+                <w:sz w:val="18"/>
+                <w:szCs w:val="18"/>
+              </w:rPr>
+              <w:t>6</w:t>
             </w:r>
           </w:p>
         </w:tc>
@@ -19217,7 +19998,7 @@
                 <w:sz w:val="18"/>
                 <w:szCs w:val="18"/>
               </w:rPr>
-              <w:t>Enviar documentação da candidatura</w:t>
+              <w:t>Candidatar-se a uma vaga</w:t>
             </w:r>
           </w:p>
         </w:tc>
@@ -19298,7 +20079,7 @@
                 <w:sz w:val="18"/>
                 <w:szCs w:val="18"/>
               </w:rPr>
-              <w:t>Enviar os documentos exigidos pela organização no ato da candidatura.</w:t>
+              <w:t>Registrar o interesse do voluntário em uma vaga específica.</w:t>
             </w:r>
           </w:p>
         </w:tc>
@@ -19325,7 +20106,14 @@
                 <w:sz w:val="18"/>
                 <w:szCs w:val="18"/>
               </w:rPr>
-              <w:t>US16</w:t>
+              <w:t>US1</w:t>
+            </w:r>
+            <w:r>
+              <w:rPr>
+                <w:sz w:val="18"/>
+                <w:szCs w:val="18"/>
+              </w:rPr>
+              <w:t>6</w:t>
             </w:r>
           </w:p>
         </w:tc>
@@ -19336,28 +20124,36 @@
         </w:trPr>
         <w:tc>
           <w:tcPr>
-            <w:tcW w:w="1250" w:type="dxa"/>
-            <w:tcBorders>
-              <w:top w:val="single" w:sz="4" w:space="0" w:color="000000"/>
-              <w:left w:val="single" w:sz="4" w:space="0" w:color="000000"/>
-              <w:bottom w:val="single" w:sz="4" w:space="0" w:color="000000"/>
-              <w:right w:val="single" w:sz="4" w:space="0" w:color="000000"/>
-            </w:tcBorders>
-          </w:tcPr>
-          <w:p>
-            <w:pPr>
-              <w:spacing w:before="20" w:after="20"/>
-              <w:rPr>
-                <w:sz w:val="18"/>
-                <w:szCs w:val="18"/>
-              </w:rPr>
-            </w:pPr>
-            <w:r>
-              <w:rPr>
-                <w:sz w:val="18"/>
-                <w:szCs w:val="18"/>
-              </w:rPr>
-              <w:t>CN06-RF17</w:t>
+            <w:tcW w:w="1251" w:type="dxa"/>
+            <w:tcBorders>
+              <w:top w:val="single" w:sz="4" w:space="0" w:color="000000"/>
+              <w:left w:val="single" w:sz="4" w:space="0" w:color="000000"/>
+              <w:bottom w:val="single" w:sz="4" w:space="0" w:color="000000"/>
+              <w:right w:val="single" w:sz="4" w:space="0" w:color="000000"/>
+            </w:tcBorders>
+          </w:tcPr>
+          <w:p>
+            <w:pPr>
+              <w:spacing w:before="20" w:after="20"/>
+              <w:rPr>
+                <w:sz w:val="18"/>
+                <w:szCs w:val="18"/>
+              </w:rPr>
+            </w:pPr>
+            <w:r>
+              <w:rPr>
+                <w:sz w:val="18"/>
+                <w:szCs w:val="18"/>
+              </w:rPr>
+              <w:lastRenderedPageBreak/>
+              <w:t>CN06-RF1</w:t>
+            </w:r>
+            <w:r>
+              <w:rPr>
+                <w:sz w:val="18"/>
+                <w:szCs w:val="18"/>
+              </w:rPr>
+              <w:t>7</w:t>
             </w:r>
           </w:p>
         </w:tc>
@@ -19411,7 +20207,7 @@
                 <w:sz w:val="18"/>
                 <w:szCs w:val="18"/>
               </w:rPr>
-              <w:t>Acompanhar candidaturas</w:t>
+              <w:t>Enviar documentação da candidatura</w:t>
             </w:r>
           </w:p>
         </w:tc>
@@ -19465,7 +20261,7 @@
                 <w:sz w:val="18"/>
                 <w:szCs w:val="18"/>
               </w:rPr>
-              <w:t>Should</w:t>
+              <w:t>Must</w:t>
             </w:r>
           </w:p>
         </w:tc>
@@ -19492,7 +20288,7 @@
                 <w:sz w:val="18"/>
                 <w:szCs w:val="18"/>
               </w:rPr>
-              <w:t>Consultar a situação das próprias candidaturas e cancelá-las.</w:t>
+              <w:t>Enviar os documentos exigidos pela organização no ato da candidatura.</w:t>
             </w:r>
           </w:p>
         </w:tc>
@@ -19519,7 +20315,14 @@
                 <w:sz w:val="18"/>
                 <w:szCs w:val="18"/>
               </w:rPr>
-              <w:t>US17</w:t>
+              <w:t>US1</w:t>
+            </w:r>
+            <w:r>
+              <w:rPr>
+                <w:sz w:val="18"/>
+                <w:szCs w:val="18"/>
+              </w:rPr>
+              <w:t>7</w:t>
             </w:r>
           </w:p>
         </w:tc>
@@ -19530,29 +20333,35 @@
         </w:trPr>
         <w:tc>
           <w:tcPr>
-            <w:tcW w:w="1250" w:type="dxa"/>
-            <w:tcBorders>
-              <w:top w:val="single" w:sz="4" w:space="0" w:color="000000"/>
-              <w:left w:val="single" w:sz="4" w:space="0" w:color="000000"/>
-              <w:bottom w:val="single" w:sz="4" w:space="0" w:color="000000"/>
-              <w:right w:val="single" w:sz="4" w:space="0" w:color="000000"/>
-            </w:tcBorders>
-          </w:tcPr>
-          <w:p>
-            <w:pPr>
-              <w:spacing w:before="20" w:after="20"/>
-              <w:rPr>
-                <w:sz w:val="18"/>
-                <w:szCs w:val="18"/>
-              </w:rPr>
-            </w:pPr>
-            <w:r>
-              <w:rPr>
-                <w:sz w:val="18"/>
-                <w:szCs w:val="18"/>
-              </w:rPr>
-              <w:lastRenderedPageBreak/>
-              <w:t>CN07-RF18</w:t>
+            <w:tcW w:w="1251" w:type="dxa"/>
+            <w:tcBorders>
+              <w:top w:val="single" w:sz="4" w:space="0" w:color="000000"/>
+              <w:left w:val="single" w:sz="4" w:space="0" w:color="000000"/>
+              <w:bottom w:val="single" w:sz="4" w:space="0" w:color="000000"/>
+              <w:right w:val="single" w:sz="4" w:space="0" w:color="000000"/>
+            </w:tcBorders>
+          </w:tcPr>
+          <w:p>
+            <w:pPr>
+              <w:spacing w:before="20" w:after="20"/>
+              <w:rPr>
+                <w:sz w:val="18"/>
+                <w:szCs w:val="18"/>
+              </w:rPr>
+            </w:pPr>
+            <w:r>
+              <w:rPr>
+                <w:sz w:val="18"/>
+                <w:szCs w:val="18"/>
+              </w:rPr>
+              <w:t>CN06-RF1</w:t>
+            </w:r>
+            <w:r>
+              <w:rPr>
+                <w:sz w:val="18"/>
+                <w:szCs w:val="18"/>
+              </w:rPr>
+              <w:t>8</w:t>
             </w:r>
           </w:p>
         </w:tc>
@@ -19606,7 +20415,7 @@
                 <w:sz w:val="18"/>
                 <w:szCs w:val="18"/>
               </w:rPr>
-              <w:t>Triar candidaturas recebidas</w:t>
+              <w:t>Acompanhar candidaturas</w:t>
             </w:r>
           </w:p>
         </w:tc>
@@ -19660,7 +20469,7 @@
                 <w:sz w:val="18"/>
                 <w:szCs w:val="18"/>
               </w:rPr>
-              <w:t>Must</w:t>
+              <w:t>Should</w:t>
             </w:r>
           </w:p>
         </w:tc>
@@ -19687,7 +20496,7 @@
                 <w:sz w:val="18"/>
                 <w:szCs w:val="18"/>
               </w:rPr>
-              <w:t>Ver os candidatos de uma vaga, com perfil e documentos, e aceitar ou recusar cada um.</w:t>
+              <w:t>Consultar a situação das próprias candidaturas e cancelá-las.</w:t>
             </w:r>
           </w:p>
         </w:tc>
@@ -19714,7 +20523,14 @@
                 <w:sz w:val="18"/>
                 <w:szCs w:val="18"/>
               </w:rPr>
-              <w:t>US18</w:t>
+              <w:t>US1</w:t>
+            </w:r>
+            <w:r>
+              <w:rPr>
+                <w:sz w:val="18"/>
+                <w:szCs w:val="18"/>
+              </w:rPr>
+              <w:t>8</w:t>
             </w:r>
           </w:p>
         </w:tc>
@@ -19725,28 +20541,35 @@
         </w:trPr>
         <w:tc>
           <w:tcPr>
-            <w:tcW w:w="1250" w:type="dxa"/>
-            <w:tcBorders>
-              <w:top w:val="single" w:sz="4" w:space="0" w:color="000000"/>
-              <w:left w:val="single" w:sz="4" w:space="0" w:color="000000"/>
-              <w:bottom w:val="single" w:sz="4" w:space="0" w:color="000000"/>
-              <w:right w:val="single" w:sz="4" w:space="0" w:color="000000"/>
-            </w:tcBorders>
-          </w:tcPr>
-          <w:p>
-            <w:pPr>
-              <w:spacing w:before="20" w:after="20"/>
-              <w:rPr>
-                <w:sz w:val="18"/>
-                <w:szCs w:val="18"/>
-              </w:rPr>
-            </w:pPr>
-            <w:r>
-              <w:rPr>
-                <w:sz w:val="18"/>
-                <w:szCs w:val="18"/>
-              </w:rPr>
-              <w:t>CN07-RF19</w:t>
+            <w:tcW w:w="1251" w:type="dxa"/>
+            <w:tcBorders>
+              <w:top w:val="single" w:sz="4" w:space="0" w:color="000000"/>
+              <w:left w:val="single" w:sz="4" w:space="0" w:color="000000"/>
+              <w:bottom w:val="single" w:sz="4" w:space="0" w:color="000000"/>
+              <w:right w:val="single" w:sz="4" w:space="0" w:color="000000"/>
+            </w:tcBorders>
+          </w:tcPr>
+          <w:p>
+            <w:pPr>
+              <w:spacing w:before="20" w:after="20"/>
+              <w:rPr>
+                <w:sz w:val="18"/>
+                <w:szCs w:val="18"/>
+              </w:rPr>
+            </w:pPr>
+            <w:r>
+              <w:rPr>
+                <w:sz w:val="18"/>
+                <w:szCs w:val="18"/>
+              </w:rPr>
+              <w:t>CN07-RF1</w:t>
+            </w:r>
+            <w:r>
+              <w:rPr>
+                <w:sz w:val="18"/>
+                <w:szCs w:val="18"/>
+              </w:rPr>
+              <w:t>9</w:t>
             </w:r>
           </w:p>
         </w:tc>
@@ -19800,7 +20623,7 @@
                 <w:sz w:val="18"/>
                 <w:szCs w:val="18"/>
               </w:rPr>
-              <w:t>Notificar resultado da candidatura</w:t>
+              <w:t>Triar candidaturas recebidas</w:t>
             </w:r>
           </w:p>
         </w:tc>
@@ -19854,7 +20677,7 @@
                 <w:sz w:val="18"/>
                 <w:szCs w:val="18"/>
               </w:rPr>
-              <w:t>Should</w:t>
+              <w:t>Must</w:t>
             </w:r>
           </w:p>
         </w:tc>
@@ -19881,7 +20704,7 @@
                 <w:sz w:val="18"/>
                 <w:szCs w:val="18"/>
               </w:rPr>
-              <w:t>Avisar o voluntário do aceite ou da recusa de sua candidatura.</w:t>
+              <w:t>Ver os candidatos de uma vaga, com perfil e documentos, e aceitar ou recusar cada um.</w:t>
             </w:r>
           </w:p>
         </w:tc>
@@ -19908,7 +20731,14 @@
                 <w:sz w:val="18"/>
                 <w:szCs w:val="18"/>
               </w:rPr>
-              <w:t>US19</w:t>
+              <w:t>US1</w:t>
+            </w:r>
+            <w:r>
+              <w:rPr>
+                <w:sz w:val="18"/>
+                <w:szCs w:val="18"/>
+              </w:rPr>
+              <w:t>9</w:t>
             </w:r>
           </w:p>
         </w:tc>
@@ -19919,28 +20749,35 @@
         </w:trPr>
         <w:tc>
           <w:tcPr>
-            <w:tcW w:w="1250" w:type="dxa"/>
-            <w:tcBorders>
-              <w:top w:val="single" w:sz="4" w:space="0" w:color="000000"/>
-              <w:left w:val="single" w:sz="4" w:space="0" w:color="000000"/>
-              <w:bottom w:val="single" w:sz="4" w:space="0" w:color="000000"/>
-              <w:right w:val="single" w:sz="4" w:space="0" w:color="000000"/>
-            </w:tcBorders>
-          </w:tcPr>
-          <w:p>
-            <w:pPr>
-              <w:spacing w:before="20" w:after="20"/>
-              <w:rPr>
-                <w:sz w:val="18"/>
-                <w:szCs w:val="18"/>
-              </w:rPr>
-            </w:pPr>
-            <w:r>
-              <w:rPr>
-                <w:sz w:val="18"/>
-                <w:szCs w:val="18"/>
-              </w:rPr>
-              <w:t>CN07-RF20</w:t>
+            <w:tcW w:w="1251" w:type="dxa"/>
+            <w:tcBorders>
+              <w:top w:val="single" w:sz="4" w:space="0" w:color="000000"/>
+              <w:left w:val="single" w:sz="4" w:space="0" w:color="000000"/>
+              <w:bottom w:val="single" w:sz="4" w:space="0" w:color="000000"/>
+              <w:right w:val="single" w:sz="4" w:space="0" w:color="000000"/>
+            </w:tcBorders>
+          </w:tcPr>
+          <w:p>
+            <w:pPr>
+              <w:spacing w:before="20" w:after="20"/>
+              <w:rPr>
+                <w:sz w:val="18"/>
+                <w:szCs w:val="18"/>
+              </w:rPr>
+            </w:pPr>
+            <w:r>
+              <w:rPr>
+                <w:sz w:val="18"/>
+                <w:szCs w:val="18"/>
+              </w:rPr>
+              <w:t>CN07-RF</w:t>
+            </w:r>
+            <w:r>
+              <w:rPr>
+                <w:sz w:val="18"/>
+                <w:szCs w:val="18"/>
+              </w:rPr>
+              <w:t>20</w:t>
             </w:r>
           </w:p>
         </w:tc>
@@ -19994,7 +20831,7 @@
                 <w:sz w:val="18"/>
                 <w:szCs w:val="18"/>
               </w:rPr>
-              <w:t>Disponibilizar contato do responsável</w:t>
+              <w:t>Notificar resultado da candidatura</w:t>
             </w:r>
           </w:p>
         </w:tc>
@@ -20048,7 +20885,7 @@
                 <w:sz w:val="18"/>
                 <w:szCs w:val="18"/>
               </w:rPr>
-              <w:t>Must</w:t>
+              <w:t>Should</w:t>
             </w:r>
           </w:p>
         </w:tc>
@@ -20075,7 +20912,7 @@
                 <w:sz w:val="18"/>
                 <w:szCs w:val="18"/>
               </w:rPr>
-              <w:t>Após o aceite, liberar ao voluntário o contato do responsável pela vaga, e vice-versa.</w:t>
+              <w:t>Avisar o voluntário do aceite ou da recusa de sua candidatura.</w:t>
             </w:r>
           </w:p>
         </w:tc>
@@ -20102,7 +20939,14 @@
                 <w:sz w:val="18"/>
                 <w:szCs w:val="18"/>
               </w:rPr>
-              <w:t>US20</w:t>
+              <w:t>US</w:t>
+            </w:r>
+            <w:r>
+              <w:rPr>
+                <w:sz w:val="18"/>
+                <w:szCs w:val="18"/>
+              </w:rPr>
+              <w:t>20</w:t>
             </w:r>
           </w:p>
         </w:tc>
@@ -20113,28 +20957,35 @@
         </w:trPr>
         <w:tc>
           <w:tcPr>
-            <w:tcW w:w="1250" w:type="dxa"/>
-            <w:tcBorders>
-              <w:top w:val="single" w:sz="4" w:space="0" w:color="000000"/>
-              <w:left w:val="single" w:sz="4" w:space="0" w:color="000000"/>
-              <w:bottom w:val="single" w:sz="4" w:space="0" w:color="000000"/>
-              <w:right w:val="single" w:sz="4" w:space="0" w:color="000000"/>
-            </w:tcBorders>
-          </w:tcPr>
-          <w:p>
-            <w:pPr>
-              <w:spacing w:before="20" w:after="20"/>
-              <w:rPr>
-                <w:sz w:val="18"/>
-                <w:szCs w:val="18"/>
-              </w:rPr>
-            </w:pPr>
-            <w:r>
-              <w:rPr>
-                <w:sz w:val="18"/>
-                <w:szCs w:val="18"/>
-              </w:rPr>
-              <w:t>CN08-RF21</w:t>
+            <w:tcW w:w="1251" w:type="dxa"/>
+            <w:tcBorders>
+              <w:top w:val="single" w:sz="4" w:space="0" w:color="000000"/>
+              <w:left w:val="single" w:sz="4" w:space="0" w:color="000000"/>
+              <w:bottom w:val="single" w:sz="4" w:space="0" w:color="000000"/>
+              <w:right w:val="single" w:sz="4" w:space="0" w:color="000000"/>
+            </w:tcBorders>
+          </w:tcPr>
+          <w:p>
+            <w:pPr>
+              <w:spacing w:before="20" w:after="20"/>
+              <w:rPr>
+                <w:sz w:val="18"/>
+                <w:szCs w:val="18"/>
+              </w:rPr>
+            </w:pPr>
+            <w:r>
+              <w:rPr>
+                <w:sz w:val="18"/>
+                <w:szCs w:val="18"/>
+              </w:rPr>
+              <w:t>CN07-RF2</w:t>
+            </w:r>
+            <w:r>
+              <w:rPr>
+                <w:sz w:val="18"/>
+                <w:szCs w:val="18"/>
+              </w:rPr>
+              <w:t>1</w:t>
             </w:r>
           </w:p>
         </w:tc>
@@ -20188,7 +21039,7 @@
                 <w:sz w:val="18"/>
                 <w:szCs w:val="18"/>
               </w:rPr>
-              <w:t>Emitir comprovante de candidatura</w:t>
+              <w:t>Disponibilizar contato do responsável</w:t>
             </w:r>
           </w:p>
         </w:tc>
@@ -20269,7 +21120,7 @@
                 <w:sz w:val="18"/>
                 <w:szCs w:val="18"/>
               </w:rPr>
-              <w:t>Gerar comprovante do registro da candidatura do voluntário na vaga.</w:t>
+              <w:t>Após o aceite, liberar ao voluntário o contato do responsável pela vaga, e vice-versa.</w:t>
             </w:r>
           </w:p>
         </w:tc>
@@ -20296,7 +21147,14 @@
                 <w:sz w:val="18"/>
                 <w:szCs w:val="18"/>
               </w:rPr>
-              <w:t>US21</w:t>
+              <w:t>US2</w:t>
+            </w:r>
+            <w:r>
+              <w:rPr>
+                <w:sz w:val="18"/>
+                <w:szCs w:val="18"/>
+              </w:rPr>
+              <w:t>1</w:t>
             </w:r>
           </w:p>
         </w:tc>
@@ -20307,28 +21165,35 @@
         </w:trPr>
         <w:tc>
           <w:tcPr>
-            <w:tcW w:w="1250" w:type="dxa"/>
-            <w:tcBorders>
-              <w:top w:val="single" w:sz="4" w:space="0" w:color="000000"/>
-              <w:left w:val="single" w:sz="4" w:space="0" w:color="000000"/>
-              <w:bottom w:val="single" w:sz="4" w:space="0" w:color="000000"/>
-              <w:right w:val="single" w:sz="4" w:space="0" w:color="000000"/>
-            </w:tcBorders>
-          </w:tcPr>
-          <w:p>
-            <w:pPr>
-              <w:spacing w:before="20" w:after="20"/>
-              <w:rPr>
-                <w:sz w:val="18"/>
-                <w:szCs w:val="18"/>
-              </w:rPr>
-            </w:pPr>
-            <w:r>
-              <w:rPr>
-                <w:sz w:val="18"/>
-                <w:szCs w:val="18"/>
-              </w:rPr>
-              <w:t>CN08-RF22</w:t>
+            <w:tcW w:w="1251" w:type="dxa"/>
+            <w:tcBorders>
+              <w:top w:val="single" w:sz="4" w:space="0" w:color="000000"/>
+              <w:left w:val="single" w:sz="4" w:space="0" w:color="000000"/>
+              <w:bottom w:val="single" w:sz="4" w:space="0" w:color="000000"/>
+              <w:right w:val="single" w:sz="4" w:space="0" w:color="000000"/>
+            </w:tcBorders>
+          </w:tcPr>
+          <w:p>
+            <w:pPr>
+              <w:spacing w:before="20" w:after="20"/>
+              <w:rPr>
+                <w:sz w:val="18"/>
+                <w:szCs w:val="18"/>
+              </w:rPr>
+            </w:pPr>
+            <w:r>
+              <w:rPr>
+                <w:sz w:val="18"/>
+                <w:szCs w:val="18"/>
+              </w:rPr>
+              <w:t>CN08-RF2</w:t>
+            </w:r>
+            <w:r>
+              <w:rPr>
+                <w:sz w:val="18"/>
+                <w:szCs w:val="18"/>
+              </w:rPr>
+              <w:t>2</w:t>
             </w:r>
           </w:p>
         </w:tc>
@@ -20382,7 +21247,7 @@
                 <w:sz w:val="18"/>
                 <w:szCs w:val="18"/>
               </w:rPr>
-              <w:t>Registrar histórico de voluntariado</w:t>
+              <w:t>Emitir comprovante de candidatura</w:t>
             </w:r>
           </w:p>
         </w:tc>
@@ -20436,7 +21301,7 @@
                 <w:sz w:val="18"/>
                 <w:szCs w:val="18"/>
               </w:rPr>
-              <w:t>Could</w:t>
+              <w:t>Must</w:t>
             </w:r>
           </w:p>
         </w:tc>
@@ -20463,7 +21328,7 @@
                 <w:sz w:val="18"/>
                 <w:szCs w:val="18"/>
               </w:rPr>
-              <w:t>Manter no perfil o histórico de atividades e de horas de voluntariado.</w:t>
+              <w:t>Gerar comprovante do registro da candidatura do voluntário na vaga.</w:t>
             </w:r>
           </w:p>
         </w:tc>
@@ -20490,7 +21355,14 @@
                 <w:sz w:val="18"/>
                 <w:szCs w:val="18"/>
               </w:rPr>
-              <w:t>US22</w:t>
+              <w:t>US2</w:t>
+            </w:r>
+            <w:r>
+              <w:rPr>
+                <w:sz w:val="18"/>
+                <w:szCs w:val="18"/>
+              </w:rPr>
+              <w:t>2</w:t>
             </w:r>
           </w:p>
         </w:tc>
@@ -20501,28 +21373,35 @@
         </w:trPr>
         <w:tc>
           <w:tcPr>
-            <w:tcW w:w="1250" w:type="dxa"/>
-            <w:tcBorders>
-              <w:top w:val="single" w:sz="4" w:space="0" w:color="000000"/>
-              <w:left w:val="single" w:sz="4" w:space="0" w:color="000000"/>
-              <w:bottom w:val="single" w:sz="4" w:space="0" w:color="000000"/>
-              <w:right w:val="single" w:sz="4" w:space="0" w:color="000000"/>
-            </w:tcBorders>
-          </w:tcPr>
-          <w:p>
-            <w:pPr>
-              <w:spacing w:before="20" w:after="20"/>
-              <w:rPr>
-                <w:sz w:val="18"/>
-                <w:szCs w:val="18"/>
-              </w:rPr>
-            </w:pPr>
-            <w:r>
-              <w:rPr>
-                <w:sz w:val="18"/>
-                <w:szCs w:val="18"/>
-              </w:rPr>
-              <w:t>CN09-RF23</w:t>
+            <w:tcW w:w="1251" w:type="dxa"/>
+            <w:tcBorders>
+              <w:top w:val="single" w:sz="4" w:space="0" w:color="000000"/>
+              <w:left w:val="single" w:sz="4" w:space="0" w:color="000000"/>
+              <w:bottom w:val="single" w:sz="4" w:space="0" w:color="000000"/>
+              <w:right w:val="single" w:sz="4" w:space="0" w:color="000000"/>
+            </w:tcBorders>
+          </w:tcPr>
+          <w:p>
+            <w:pPr>
+              <w:spacing w:before="20" w:after="20"/>
+              <w:rPr>
+                <w:sz w:val="18"/>
+                <w:szCs w:val="18"/>
+              </w:rPr>
+            </w:pPr>
+            <w:r>
+              <w:rPr>
+                <w:sz w:val="18"/>
+                <w:szCs w:val="18"/>
+              </w:rPr>
+              <w:t>CN08-RF2</w:t>
+            </w:r>
+            <w:r>
+              <w:rPr>
+                <w:sz w:val="18"/>
+                <w:szCs w:val="18"/>
+              </w:rPr>
+              <w:t>3</w:t>
             </w:r>
           </w:p>
         </w:tc>
@@ -20576,7 +21455,7 @@
                 <w:sz w:val="18"/>
                 <w:szCs w:val="18"/>
               </w:rPr>
-              <w:t>Homologar cadastro de organizações</w:t>
+              <w:t>Registrar histórico de voluntariado</w:t>
             </w:r>
           </w:p>
         </w:tc>
@@ -20625,13 +21504,15 @@
                 <w:szCs w:val="18"/>
               </w:rPr>
             </w:pPr>
-            <w:r>
-              <w:rPr>
-                <w:sz w:val="18"/>
-                <w:szCs w:val="18"/>
-              </w:rPr>
-              <w:t>Should</w:t>
-            </w:r>
+            <w:proofErr w:type="spellStart"/>
+            <w:r>
+              <w:rPr>
+                <w:sz w:val="18"/>
+                <w:szCs w:val="18"/>
+              </w:rPr>
+              <w:t>Could</w:t>
+            </w:r>
+            <w:proofErr w:type="spellEnd"/>
           </w:p>
         </w:tc>
         <w:tc>
@@ -20657,7 +21538,7 @@
                 <w:sz w:val="18"/>
                 <w:szCs w:val="18"/>
               </w:rPr>
-              <w:t>Validar o cadastro de uma ONG antes de suas vagas serem publicadas.</w:t>
+              <w:t>Manter no perfil o histórico de atividades e de horas de voluntariado.</w:t>
             </w:r>
           </w:p>
         </w:tc>
@@ -20684,7 +21565,14 @@
                 <w:sz w:val="18"/>
                 <w:szCs w:val="18"/>
               </w:rPr>
-              <w:t>US23</w:t>
+              <w:t>US2</w:t>
+            </w:r>
+            <w:r>
+              <w:rPr>
+                <w:sz w:val="18"/>
+                <w:szCs w:val="18"/>
+              </w:rPr>
+              <w:t>3</w:t>
             </w:r>
           </w:p>
         </w:tc>
@@ -20695,28 +21583,35 @@
         </w:trPr>
         <w:tc>
           <w:tcPr>
-            <w:tcW w:w="1250" w:type="dxa"/>
-            <w:tcBorders>
-              <w:top w:val="single" w:sz="4" w:space="0" w:color="000000"/>
-              <w:left w:val="single" w:sz="4" w:space="0" w:color="000000"/>
-              <w:bottom w:val="single" w:sz="4" w:space="0" w:color="000000"/>
-              <w:right w:val="single" w:sz="4" w:space="0" w:color="000000"/>
-            </w:tcBorders>
-          </w:tcPr>
-          <w:p>
-            <w:pPr>
-              <w:spacing w:before="20" w:after="20"/>
-              <w:rPr>
-                <w:sz w:val="18"/>
-                <w:szCs w:val="18"/>
-              </w:rPr>
-            </w:pPr>
-            <w:r>
-              <w:rPr>
-                <w:sz w:val="18"/>
-                <w:szCs w:val="18"/>
-              </w:rPr>
-              <w:t>CN09-RF24</w:t>
+            <w:tcW w:w="1251" w:type="dxa"/>
+            <w:tcBorders>
+              <w:top w:val="single" w:sz="4" w:space="0" w:color="000000"/>
+              <w:left w:val="single" w:sz="4" w:space="0" w:color="000000"/>
+              <w:bottom w:val="single" w:sz="4" w:space="0" w:color="000000"/>
+              <w:right w:val="single" w:sz="4" w:space="0" w:color="000000"/>
+            </w:tcBorders>
+          </w:tcPr>
+          <w:p>
+            <w:pPr>
+              <w:spacing w:before="20" w:after="20"/>
+              <w:rPr>
+                <w:sz w:val="18"/>
+                <w:szCs w:val="18"/>
+              </w:rPr>
+            </w:pPr>
+            <w:r>
+              <w:rPr>
+                <w:sz w:val="18"/>
+                <w:szCs w:val="18"/>
+              </w:rPr>
+              <w:t>CN09-RF2</w:t>
+            </w:r>
+            <w:r>
+              <w:rPr>
+                <w:sz w:val="18"/>
+                <w:szCs w:val="18"/>
+              </w:rPr>
+              <w:t>4</w:t>
             </w:r>
           </w:p>
         </w:tc>
@@ -20770,7 +21665,7 @@
                 <w:sz w:val="18"/>
                 <w:szCs w:val="18"/>
               </w:rPr>
-              <w:t>Moderar vagas e usuários</w:t>
+              <w:t>Homologar cadastro de organizações</w:t>
             </w:r>
           </w:p>
         </w:tc>
@@ -20824,7 +21719,7 @@
                 <w:sz w:val="18"/>
                 <w:szCs w:val="18"/>
               </w:rPr>
-              <w:t>Could</w:t>
+              <w:t>Should</w:t>
             </w:r>
           </w:p>
         </w:tc>
@@ -20851,7 +21746,7 @@
                 <w:sz w:val="18"/>
                 <w:szCs w:val="18"/>
               </w:rPr>
-              <w:t>Remover vagas irregulares e suspender contas.</w:t>
+              <w:t>Validar o cadastro de uma ONG antes de suas vagas serem publicadas.</w:t>
             </w:r>
           </w:p>
         </w:tc>
@@ -20878,7 +21773,14 @@
                 <w:sz w:val="18"/>
                 <w:szCs w:val="18"/>
               </w:rPr>
-              <w:t>US24</w:t>
+              <w:t>US2</w:t>
+            </w:r>
+            <w:r>
+              <w:rPr>
+                <w:sz w:val="18"/>
+                <w:szCs w:val="18"/>
+              </w:rPr>
+              <w:t>4</w:t>
             </w:r>
           </w:p>
         </w:tc>
@@ -20889,28 +21791,35 @@
         </w:trPr>
         <w:tc>
           <w:tcPr>
-            <w:tcW w:w="1250" w:type="dxa"/>
-            <w:tcBorders>
-              <w:top w:val="single" w:sz="4" w:space="0" w:color="000000"/>
-              <w:left w:val="single" w:sz="4" w:space="0" w:color="000000"/>
-              <w:bottom w:val="single" w:sz="4" w:space="0" w:color="000000"/>
-              <w:right w:val="single" w:sz="4" w:space="0" w:color="000000"/>
-            </w:tcBorders>
-          </w:tcPr>
-          <w:p>
-            <w:pPr>
-              <w:spacing w:before="20" w:after="20"/>
-              <w:rPr>
-                <w:sz w:val="18"/>
-                <w:szCs w:val="18"/>
-              </w:rPr>
-            </w:pPr>
-            <w:r>
-              <w:rPr>
-                <w:sz w:val="18"/>
-                <w:szCs w:val="18"/>
-              </w:rPr>
-              <w:t>RNF01</w:t>
+            <w:tcW w:w="1251" w:type="dxa"/>
+            <w:tcBorders>
+              <w:top w:val="single" w:sz="4" w:space="0" w:color="000000"/>
+              <w:left w:val="single" w:sz="4" w:space="0" w:color="000000"/>
+              <w:bottom w:val="single" w:sz="4" w:space="0" w:color="000000"/>
+              <w:right w:val="single" w:sz="4" w:space="0" w:color="000000"/>
+            </w:tcBorders>
+          </w:tcPr>
+          <w:p>
+            <w:pPr>
+              <w:spacing w:before="20" w:after="20"/>
+              <w:rPr>
+                <w:sz w:val="18"/>
+                <w:szCs w:val="18"/>
+              </w:rPr>
+            </w:pPr>
+            <w:r>
+              <w:rPr>
+                <w:sz w:val="18"/>
+                <w:szCs w:val="18"/>
+              </w:rPr>
+              <w:t>CN09-RF2</w:t>
+            </w:r>
+            <w:r>
+              <w:rPr>
+                <w:sz w:val="18"/>
+                <w:szCs w:val="18"/>
+              </w:rPr>
+              <w:t>5</w:t>
             </w:r>
           </w:p>
         </w:tc>
@@ -20964,7 +21873,7 @@
                 <w:sz w:val="18"/>
                 <w:szCs w:val="18"/>
               </w:rPr>
-              <w:t>Usabilidade</w:t>
+              <w:t>Moderar vagas e usuários</w:t>
             </w:r>
           </w:p>
         </w:tc>
@@ -20991,7 +21900,7 @@
                 <w:sz w:val="18"/>
                 <w:szCs w:val="18"/>
               </w:rPr>
-              <w:t>Não funcional</w:t>
+              <w:t>Funcional</w:t>
             </w:r>
           </w:p>
         </w:tc>
@@ -21013,13 +21922,15 @@
                 <w:szCs w:val="18"/>
               </w:rPr>
             </w:pPr>
-            <w:r>
-              <w:rPr>
-                <w:sz w:val="18"/>
-                <w:szCs w:val="18"/>
-              </w:rPr>
-              <w:t>Must</w:t>
-            </w:r>
+            <w:proofErr w:type="spellStart"/>
+            <w:r>
+              <w:rPr>
+                <w:sz w:val="18"/>
+                <w:szCs w:val="18"/>
+              </w:rPr>
+              <w:t>Could</w:t>
+            </w:r>
+            <w:proofErr w:type="spellEnd"/>
           </w:p>
         </w:tc>
         <w:tc>
@@ -21045,7 +21956,7 @@
                 <w:sz w:val="18"/>
                 <w:szCs w:val="18"/>
               </w:rPr>
-              <w:t>Usuário sem treinamento conclui busca e candidatura, conforme a meta da métrica M6.</w:t>
+              <w:t>Remover vagas irregulares e suspender contas.</w:t>
             </w:r>
           </w:p>
         </w:tc>
@@ -21072,7 +21983,14 @@
                 <w:sz w:val="18"/>
                 <w:szCs w:val="18"/>
               </w:rPr>
-              <w:t>-</w:t>
+              <w:t>US2</w:t>
+            </w:r>
+            <w:r>
+              <w:rPr>
+                <w:sz w:val="18"/>
+                <w:szCs w:val="18"/>
+              </w:rPr>
+              <w:t>5</w:t>
             </w:r>
           </w:p>
         </w:tc>
@@ -21083,28 +22001,28 @@
         </w:trPr>
         <w:tc>
           <w:tcPr>
-            <w:tcW w:w="1250" w:type="dxa"/>
-            <w:tcBorders>
-              <w:top w:val="single" w:sz="4" w:space="0" w:color="000000"/>
-              <w:left w:val="single" w:sz="4" w:space="0" w:color="000000"/>
-              <w:bottom w:val="single" w:sz="4" w:space="0" w:color="000000"/>
-              <w:right w:val="single" w:sz="4" w:space="0" w:color="000000"/>
-            </w:tcBorders>
-          </w:tcPr>
-          <w:p>
-            <w:pPr>
-              <w:spacing w:before="20" w:after="20"/>
-              <w:rPr>
-                <w:sz w:val="18"/>
-                <w:szCs w:val="18"/>
-              </w:rPr>
-            </w:pPr>
-            <w:r>
-              <w:rPr>
-                <w:sz w:val="18"/>
-                <w:szCs w:val="18"/>
-              </w:rPr>
-              <w:t>RNF02</w:t>
+            <w:tcW w:w="1251" w:type="dxa"/>
+            <w:tcBorders>
+              <w:top w:val="single" w:sz="4" w:space="0" w:color="000000"/>
+              <w:left w:val="single" w:sz="4" w:space="0" w:color="000000"/>
+              <w:bottom w:val="single" w:sz="4" w:space="0" w:color="000000"/>
+              <w:right w:val="single" w:sz="4" w:space="0" w:color="000000"/>
+            </w:tcBorders>
+          </w:tcPr>
+          <w:p>
+            <w:pPr>
+              <w:spacing w:before="20" w:after="20"/>
+              <w:rPr>
+                <w:sz w:val="18"/>
+                <w:szCs w:val="18"/>
+              </w:rPr>
+            </w:pPr>
+            <w:r>
+              <w:rPr>
+                <w:sz w:val="18"/>
+                <w:szCs w:val="18"/>
+              </w:rPr>
+              <w:t>RNF01</w:t>
             </w:r>
           </w:p>
         </w:tc>
@@ -21158,7 +22076,7 @@
                 <w:sz w:val="18"/>
                 <w:szCs w:val="18"/>
               </w:rPr>
-              <w:t>Responsividade</w:t>
+              <w:t>Usabilidade</w:t>
             </w:r>
           </w:p>
         </w:tc>
@@ -21239,39 +22157,7 @@
                 <w:sz w:val="18"/>
                 <w:szCs w:val="18"/>
               </w:rPr>
-              <w:t xml:space="preserve">Adaptar-se a telas de celular, </w:t>
-            </w:r>
-            <w:r>
-              <w:rPr>
-                <w:i/>
-                <w:iCs/>
-                <w:sz w:val="18"/>
-                <w:szCs w:val="18"/>
-              </w:rPr>
-              <w:t>tablet</w:t>
-            </w:r>
-            <w:r>
-              <w:rPr>
-                <w:sz w:val="18"/>
-                <w:szCs w:val="18"/>
-              </w:rPr>
-              <w:t xml:space="preserve"> e </w:t>
-            </w:r>
-            <w:r>
-              <w:rPr>
-                <w:i/>
-                <w:iCs/>
-                <w:sz w:val="18"/>
-                <w:szCs w:val="18"/>
-              </w:rPr>
-              <w:t>desktop</w:t>
-            </w:r>
-            <w:r>
-              <w:rPr>
-                <w:sz w:val="18"/>
-                <w:szCs w:val="18"/>
-              </w:rPr>
-              <w:t>.</w:t>
+              <w:t>Usuário sem treinamento conclui busca e candidatura, conforme a meta da métrica M6.</w:t>
             </w:r>
           </w:p>
         </w:tc>
@@ -21309,28 +22195,28 @@
         </w:trPr>
         <w:tc>
           <w:tcPr>
-            <w:tcW w:w="1250" w:type="dxa"/>
-            <w:tcBorders>
-              <w:top w:val="single" w:sz="4" w:space="0" w:color="000000"/>
-              <w:left w:val="single" w:sz="4" w:space="0" w:color="000000"/>
-              <w:bottom w:val="single" w:sz="4" w:space="0" w:color="000000"/>
-              <w:right w:val="single" w:sz="4" w:space="0" w:color="000000"/>
-            </w:tcBorders>
-          </w:tcPr>
-          <w:p>
-            <w:pPr>
-              <w:spacing w:before="20" w:after="20"/>
-              <w:rPr>
-                <w:sz w:val="18"/>
-                <w:szCs w:val="18"/>
-              </w:rPr>
-            </w:pPr>
-            <w:r>
-              <w:rPr>
-                <w:sz w:val="18"/>
-                <w:szCs w:val="18"/>
-              </w:rPr>
-              <w:t>RNF03</w:t>
+            <w:tcW w:w="1251" w:type="dxa"/>
+            <w:tcBorders>
+              <w:top w:val="single" w:sz="4" w:space="0" w:color="000000"/>
+              <w:left w:val="single" w:sz="4" w:space="0" w:color="000000"/>
+              <w:bottom w:val="single" w:sz="4" w:space="0" w:color="000000"/>
+              <w:right w:val="single" w:sz="4" w:space="0" w:color="000000"/>
+            </w:tcBorders>
+          </w:tcPr>
+          <w:p>
+            <w:pPr>
+              <w:spacing w:before="20" w:after="20"/>
+              <w:rPr>
+                <w:sz w:val="18"/>
+                <w:szCs w:val="18"/>
+              </w:rPr>
+            </w:pPr>
+            <w:r>
+              <w:rPr>
+                <w:sz w:val="18"/>
+                <w:szCs w:val="18"/>
+              </w:rPr>
+              <w:t>RNF02</w:t>
             </w:r>
           </w:p>
         </w:tc>
@@ -21384,7 +22270,7 @@
                 <w:sz w:val="18"/>
                 <w:szCs w:val="18"/>
               </w:rPr>
-              <w:t>Acessibilidade</w:t>
+              <w:t>Responsividade</w:t>
             </w:r>
           </w:p>
         </w:tc>
@@ -21438,7 +22324,7 @@
                 <w:sz w:val="18"/>
                 <w:szCs w:val="18"/>
               </w:rPr>
-              <w:t>Should</w:t>
+              <w:t>Must</w:t>
             </w:r>
           </w:p>
         </w:tc>
@@ -21465,7 +22351,55 @@
                 <w:sz w:val="18"/>
                 <w:szCs w:val="18"/>
               </w:rPr>
-              <w:t>Seguir boas práticas de acessibilidade web (contraste, textos alternativos, teclado).</w:t>
+              <w:t xml:space="preserve">Adaptar-se </w:t>
+            </w:r>
+            <w:proofErr w:type="spellStart"/>
+            <w:r>
+              <w:rPr>
+                <w:sz w:val="18"/>
+                <w:szCs w:val="18"/>
+              </w:rPr>
+              <w:t>a</w:t>
+            </w:r>
+            <w:proofErr w:type="spellEnd"/>
+            <w:r>
+              <w:rPr>
+                <w:sz w:val="18"/>
+                <w:szCs w:val="18"/>
+              </w:rPr>
+              <w:t xml:space="preserve"> telas de celular, </w:t>
+            </w:r>
+            <w:r>
+              <w:rPr>
+                <w:i/>
+                <w:iCs/>
+                <w:sz w:val="18"/>
+                <w:szCs w:val="18"/>
+              </w:rPr>
+              <w:t>tablet</w:t>
+            </w:r>
+            <w:r>
+              <w:rPr>
+                <w:sz w:val="18"/>
+                <w:szCs w:val="18"/>
+              </w:rPr>
+              <w:t xml:space="preserve"> e </w:t>
+            </w:r>
+            <w:r>
+              <w:rPr>
+                <w:i/>
+                <w:iCs/>
+                <w:sz w:val="18"/>
+                <w:szCs w:val="18"/>
+              </w:rPr>
+              <w:t>desktop</w:t>
+            </w:r>
+            <w:r>
+              <w:rPr>
+                <w:sz w:val="18"/>
+                <w:szCs w:val="18"/>
+              </w:rPr>
+              <w:t>.</w:t>
             </w:r>
           </w:p>
         </w:tc>
@@ -21503,28 +22437,28 @@
         </w:trPr>
         <w:tc>
           <w:tcPr>
-            <w:tcW w:w="1250" w:type="dxa"/>
-            <w:tcBorders>
-              <w:top w:val="single" w:sz="4" w:space="0" w:color="000000"/>
-              <w:left w:val="single" w:sz="4" w:space="0" w:color="000000"/>
-              <w:bottom w:val="single" w:sz="4" w:space="0" w:color="000000"/>
-              <w:right w:val="single" w:sz="4" w:space="0" w:color="000000"/>
-            </w:tcBorders>
-          </w:tcPr>
-          <w:p>
-            <w:pPr>
-              <w:spacing w:before="20" w:after="20"/>
-              <w:rPr>
-                <w:sz w:val="18"/>
-                <w:szCs w:val="18"/>
-              </w:rPr>
-            </w:pPr>
-            <w:r>
-              <w:rPr>
-                <w:sz w:val="18"/>
-                <w:szCs w:val="18"/>
-              </w:rPr>
-              <w:t>RNF04</w:t>
+            <w:tcW w:w="1251" w:type="dxa"/>
+            <w:tcBorders>
+              <w:top w:val="single" w:sz="4" w:space="0" w:color="000000"/>
+              <w:left w:val="single" w:sz="4" w:space="0" w:color="000000"/>
+              <w:bottom w:val="single" w:sz="4" w:space="0" w:color="000000"/>
+              <w:right w:val="single" w:sz="4" w:space="0" w:color="000000"/>
+            </w:tcBorders>
+          </w:tcPr>
+          <w:p>
+            <w:pPr>
+              <w:spacing w:before="20" w:after="20"/>
+              <w:rPr>
+                <w:sz w:val="18"/>
+                <w:szCs w:val="18"/>
+              </w:rPr>
+            </w:pPr>
+            <w:r>
+              <w:rPr>
+                <w:sz w:val="18"/>
+                <w:szCs w:val="18"/>
+              </w:rPr>
+              <w:t>RNF03</w:t>
             </w:r>
           </w:p>
         </w:tc>
@@ -21578,7 +22512,7 @@
                 <w:sz w:val="18"/>
                 <w:szCs w:val="18"/>
               </w:rPr>
-              <w:t>Segurança dos dados</w:t>
+              <w:t>Acessibilidade</w:t>
             </w:r>
           </w:p>
         </w:tc>
@@ -21632,7 +22566,7 @@
                 <w:sz w:val="18"/>
                 <w:szCs w:val="18"/>
               </w:rPr>
-              <w:t>Must</w:t>
+              <w:t>Should</w:t>
             </w:r>
           </w:p>
         </w:tc>
@@ -21659,7 +22593,7 @@
                 <w:sz w:val="18"/>
                 <w:szCs w:val="18"/>
               </w:rPr>
-              <w:t>Senhas cifradas; documentos visíveis apenas à ONG da vaga e ao próprio voluntário.</w:t>
+              <w:t>Seguir boas práticas de acessibilidade web (contraste, textos alternativos, teclado).</w:t>
             </w:r>
           </w:p>
         </w:tc>
@@ -21697,28 +22631,28 @@
         </w:trPr>
         <w:tc>
           <w:tcPr>
-            <w:tcW w:w="1250" w:type="dxa"/>
-            <w:tcBorders>
-              <w:top w:val="single" w:sz="4" w:space="0" w:color="000000"/>
-              <w:left w:val="single" w:sz="4" w:space="0" w:color="000000"/>
-              <w:bottom w:val="single" w:sz="4" w:space="0" w:color="000000"/>
-              <w:right w:val="single" w:sz="4" w:space="0" w:color="000000"/>
-            </w:tcBorders>
-          </w:tcPr>
-          <w:p>
-            <w:pPr>
-              <w:spacing w:before="20" w:after="20"/>
-              <w:rPr>
-                <w:sz w:val="18"/>
-                <w:szCs w:val="18"/>
-              </w:rPr>
-            </w:pPr>
-            <w:r>
-              <w:rPr>
-                <w:sz w:val="18"/>
-                <w:szCs w:val="18"/>
-              </w:rPr>
-              <w:t>RNF05</w:t>
+            <w:tcW w:w="1251" w:type="dxa"/>
+            <w:tcBorders>
+              <w:top w:val="single" w:sz="4" w:space="0" w:color="000000"/>
+              <w:left w:val="single" w:sz="4" w:space="0" w:color="000000"/>
+              <w:bottom w:val="single" w:sz="4" w:space="0" w:color="000000"/>
+              <w:right w:val="single" w:sz="4" w:space="0" w:color="000000"/>
+            </w:tcBorders>
+          </w:tcPr>
+          <w:p>
+            <w:pPr>
+              <w:spacing w:before="20" w:after="20"/>
+              <w:rPr>
+                <w:sz w:val="18"/>
+                <w:szCs w:val="18"/>
+              </w:rPr>
+            </w:pPr>
+            <w:r>
+              <w:rPr>
+                <w:sz w:val="18"/>
+                <w:szCs w:val="18"/>
+              </w:rPr>
+              <w:t>RNF04</w:t>
             </w:r>
           </w:p>
         </w:tc>
@@ -21772,7 +22706,7 @@
                 <w:sz w:val="18"/>
                 <w:szCs w:val="18"/>
               </w:rPr>
-              <w:t>Controle de acesso por perfil</w:t>
+              <w:t>Segurança dos dados</w:t>
             </w:r>
           </w:p>
         </w:tc>
@@ -21853,7 +22787,7 @@
                 <w:sz w:val="18"/>
                 <w:szCs w:val="18"/>
               </w:rPr>
-              <w:t>Cada perfil da Tabela 4 acessa apenas as funcionalidades permitidas.</w:t>
+              <w:t>Senhas cifradas; documentos visíveis apenas à ONG da vaga e ao próprio voluntário.</w:t>
             </w:r>
           </w:p>
         </w:tc>
@@ -21891,28 +22825,28 @@
         </w:trPr>
         <w:tc>
           <w:tcPr>
-            <w:tcW w:w="1250" w:type="dxa"/>
-            <w:tcBorders>
-              <w:top w:val="single" w:sz="4" w:space="0" w:color="000000"/>
-              <w:left w:val="single" w:sz="4" w:space="0" w:color="000000"/>
-              <w:bottom w:val="single" w:sz="4" w:space="0" w:color="000000"/>
-              <w:right w:val="single" w:sz="4" w:space="0" w:color="000000"/>
-            </w:tcBorders>
-          </w:tcPr>
-          <w:p>
-            <w:pPr>
-              <w:spacing w:before="20" w:after="20"/>
-              <w:rPr>
-                <w:sz w:val="18"/>
-                <w:szCs w:val="18"/>
-              </w:rPr>
-            </w:pPr>
-            <w:r>
-              <w:rPr>
-                <w:sz w:val="18"/>
-                <w:szCs w:val="18"/>
-              </w:rPr>
-              <w:t>RNF06</w:t>
+            <w:tcW w:w="1251" w:type="dxa"/>
+            <w:tcBorders>
+              <w:top w:val="single" w:sz="4" w:space="0" w:color="000000"/>
+              <w:left w:val="single" w:sz="4" w:space="0" w:color="000000"/>
+              <w:bottom w:val="single" w:sz="4" w:space="0" w:color="000000"/>
+              <w:right w:val="single" w:sz="4" w:space="0" w:color="000000"/>
+            </w:tcBorders>
+          </w:tcPr>
+          <w:p>
+            <w:pPr>
+              <w:spacing w:before="20" w:after="20"/>
+              <w:rPr>
+                <w:sz w:val="18"/>
+                <w:szCs w:val="18"/>
+              </w:rPr>
+            </w:pPr>
+            <w:r>
+              <w:rPr>
+                <w:sz w:val="18"/>
+                <w:szCs w:val="18"/>
+              </w:rPr>
+              <w:t>RNF05</w:t>
             </w:r>
           </w:p>
         </w:tc>
@@ -21966,7 +22900,7 @@
                 <w:sz w:val="18"/>
                 <w:szCs w:val="18"/>
               </w:rPr>
-              <w:t>Desempenho da busca</w:t>
+              <w:t>Controle de acesso por perfil</w:t>
             </w:r>
           </w:p>
         </w:tc>
@@ -22020,7 +22954,7 @@
                 <w:sz w:val="18"/>
                 <w:szCs w:val="18"/>
               </w:rPr>
-              <w:t>Should</w:t>
+              <w:t>Must</w:t>
             </w:r>
           </w:p>
         </w:tc>
@@ -22047,7 +22981,7 @@
                 <w:sz w:val="18"/>
                 <w:szCs w:val="18"/>
               </w:rPr>
-              <w:t>Apresentar o resultado da busca com filtros em tempo adequado à interação.</w:t>
+              <w:t>Cada perfil da Tabela 4 acessa apenas as funcionalidades permitidas.</w:t>
             </w:r>
           </w:p>
         </w:tc>
@@ -22085,7 +23019,201 @@
         </w:trPr>
         <w:tc>
           <w:tcPr>
-            <w:tcW w:w="1250" w:type="dxa"/>
+            <w:tcW w:w="1251" w:type="dxa"/>
+            <w:tcBorders>
+              <w:top w:val="single" w:sz="4" w:space="0" w:color="000000"/>
+              <w:left w:val="single" w:sz="4" w:space="0" w:color="000000"/>
+              <w:bottom w:val="single" w:sz="4" w:space="0" w:color="000000"/>
+              <w:right w:val="single" w:sz="4" w:space="0" w:color="000000"/>
+            </w:tcBorders>
+          </w:tcPr>
+          <w:p>
+            <w:pPr>
+              <w:spacing w:before="20" w:after="20"/>
+              <w:rPr>
+                <w:sz w:val="18"/>
+                <w:szCs w:val="18"/>
+              </w:rPr>
+            </w:pPr>
+            <w:r>
+              <w:rPr>
+                <w:sz w:val="18"/>
+                <w:szCs w:val="18"/>
+              </w:rPr>
+              <w:t>RNF06</w:t>
+            </w:r>
+          </w:p>
+        </w:tc>
+        <w:tc>
+          <w:tcPr>
+            <w:tcW w:w="999" w:type="dxa"/>
+            <w:tcBorders>
+              <w:top w:val="single" w:sz="4" w:space="0" w:color="000000"/>
+              <w:left w:val="single" w:sz="4" w:space="0" w:color="000000"/>
+              <w:bottom w:val="single" w:sz="4" w:space="0" w:color="000000"/>
+              <w:right w:val="single" w:sz="4" w:space="0" w:color="000000"/>
+            </w:tcBorders>
+          </w:tcPr>
+          <w:p>
+            <w:pPr>
+              <w:spacing w:before="20" w:after="20"/>
+              <w:rPr>
+                <w:sz w:val="18"/>
+                <w:szCs w:val="18"/>
+              </w:rPr>
+            </w:pPr>
+            <w:r>
+              <w:rPr>
+                <w:sz w:val="18"/>
+                <w:szCs w:val="18"/>
+              </w:rPr>
+              <w:t>A definir</w:t>
+            </w:r>
+          </w:p>
+        </w:tc>
+        <w:tc>
+          <w:tcPr>
+            <w:tcW w:w="2500" w:type="dxa"/>
+            <w:tcBorders>
+              <w:top w:val="single" w:sz="4" w:space="0" w:color="000000"/>
+              <w:left w:val="single" w:sz="4" w:space="0" w:color="000000"/>
+              <w:bottom w:val="single" w:sz="4" w:space="0" w:color="000000"/>
+              <w:right w:val="single" w:sz="4" w:space="0" w:color="000000"/>
+            </w:tcBorders>
+          </w:tcPr>
+          <w:p>
+            <w:pPr>
+              <w:spacing w:before="20" w:after="20"/>
+              <w:rPr>
+                <w:sz w:val="18"/>
+                <w:szCs w:val="18"/>
+              </w:rPr>
+            </w:pPr>
+            <w:r>
+              <w:rPr>
+                <w:sz w:val="18"/>
+                <w:szCs w:val="18"/>
+              </w:rPr>
+              <w:t>Desempenho da busca</w:t>
+            </w:r>
+          </w:p>
+        </w:tc>
+        <w:tc>
+          <w:tcPr>
+            <w:tcW w:w="1251" w:type="dxa"/>
+            <w:tcBorders>
+              <w:top w:val="single" w:sz="4" w:space="0" w:color="000000"/>
+              <w:left w:val="single" w:sz="4" w:space="0" w:color="000000"/>
+              <w:bottom w:val="single" w:sz="4" w:space="0" w:color="000000"/>
+              <w:right w:val="single" w:sz="4" w:space="0" w:color="000000"/>
+            </w:tcBorders>
+          </w:tcPr>
+          <w:p>
+            <w:pPr>
+              <w:spacing w:before="20" w:after="20"/>
+              <w:rPr>
+                <w:sz w:val="18"/>
+                <w:szCs w:val="18"/>
+              </w:rPr>
+            </w:pPr>
+            <w:r>
+              <w:rPr>
+                <w:sz w:val="18"/>
+                <w:szCs w:val="18"/>
+              </w:rPr>
+              <w:t>Não funcional</w:t>
+            </w:r>
+          </w:p>
+        </w:tc>
+        <w:tc>
+          <w:tcPr>
+            <w:tcW w:w="1099" w:type="dxa"/>
+            <w:tcBorders>
+              <w:top w:val="single" w:sz="4" w:space="0" w:color="000000"/>
+              <w:left w:val="single" w:sz="4" w:space="0" w:color="000000"/>
+              <w:bottom w:val="single" w:sz="4" w:space="0" w:color="000000"/>
+              <w:right w:val="single" w:sz="4" w:space="0" w:color="000000"/>
+            </w:tcBorders>
+          </w:tcPr>
+          <w:p>
+            <w:pPr>
+              <w:spacing w:before="20" w:after="20"/>
+              <w:rPr>
+                <w:sz w:val="18"/>
+                <w:szCs w:val="18"/>
+              </w:rPr>
+            </w:pPr>
+            <w:r>
+              <w:rPr>
+                <w:sz w:val="18"/>
+                <w:szCs w:val="18"/>
+              </w:rPr>
+              <w:t>Should</w:t>
+            </w:r>
+          </w:p>
+        </w:tc>
+        <w:tc>
+          <w:tcPr>
+            <w:tcW w:w="5758" w:type="dxa"/>
+            <w:tcBorders>
+              <w:top w:val="single" w:sz="4" w:space="0" w:color="000000"/>
+              <w:left w:val="single" w:sz="4" w:space="0" w:color="000000"/>
+              <w:bottom w:val="single" w:sz="4" w:space="0" w:color="000000"/>
+              <w:right w:val="single" w:sz="4" w:space="0" w:color="000000"/>
+            </w:tcBorders>
+          </w:tcPr>
+          <w:p>
+            <w:pPr>
+              <w:spacing w:before="20" w:after="20"/>
+              <w:rPr>
+                <w:sz w:val="18"/>
+                <w:szCs w:val="18"/>
+              </w:rPr>
+            </w:pPr>
+            <w:r>
+              <w:rPr>
+                <w:sz w:val="18"/>
+                <w:szCs w:val="18"/>
+              </w:rPr>
+              <w:t>Apresentar o resultado da busca com filtros em tempo adequado à interação.</w:t>
+            </w:r>
+          </w:p>
+        </w:tc>
+        <w:tc>
+          <w:tcPr>
+            <w:tcW w:w="1099" w:type="dxa"/>
+            <w:tcBorders>
+              <w:top w:val="single" w:sz="4" w:space="0" w:color="000000"/>
+              <w:left w:val="single" w:sz="4" w:space="0" w:color="000000"/>
+              <w:bottom w:val="single" w:sz="4" w:space="0" w:color="000000"/>
+              <w:right w:val="single" w:sz="4" w:space="0" w:color="000000"/>
+            </w:tcBorders>
+          </w:tcPr>
+          <w:p>
+            <w:pPr>
+              <w:spacing w:before="20" w:after="20"/>
+              <w:rPr>
+                <w:sz w:val="18"/>
+                <w:szCs w:val="18"/>
+              </w:rPr>
+            </w:pPr>
+            <w:r>
+              <w:rPr>
+                <w:sz w:val="18"/>
+                <w:szCs w:val="18"/>
+              </w:rPr>
+              <w:t>-</w:t>
+            </w:r>
+          </w:p>
+        </w:tc>
+      </w:tr>
+      <w:tr>
+        <w:trPr>
+          <w:cantSplit/>
+        </w:trPr>
+        <w:tc>
+          <w:tcPr>
+            <w:tcW w:w="1251" w:type="dxa"/>
             <w:tcBorders>
               <w:top w:val="single" w:sz="4" w:space="0" w:color="000000"/>
               <w:left w:val="single" w:sz="4" w:space="0" w:color="000000"/>
@@ -22283,9 +23411,6 @@
     </w:tbl>
     <w:p>
       <w:pPr>
-        <w:keepNext/>
-        <w:keepLines/>
-        <w:spacing w:before="60"/>
         <w:rPr>
           <w:sz w:val="20"/>
           <w:szCs w:val="20"/>
@@ -22366,13 +23491,47 @@
       <w:r>
         <w:t xml:space="preserve"> (</w:t>
       </w:r>
+      <w:proofErr w:type="spellStart"/>
       <w:r>
         <w:rPr>
           <w:i/>
           <w:iCs/>
         </w:rPr>
-        <w:t>Goal Question Metric</w:t>
-      </w:r>
+        <w:t>Goal</w:t>
+      </w:r>
+      <w:proofErr w:type="spellEnd"/>
+      <w:r>
+        <w:rPr>
+          <w:i/>
+          <w:iCs/>
+        </w:rPr>
+        <w:t xml:space="preserve"> </w:t>
+      </w:r>
+      <w:proofErr w:type="spellStart"/>
+      <w:r>
+        <w:rPr>
+          <w:i/>
+          <w:iCs/>
+        </w:rPr>
+        <w:t>Question</w:t>
+      </w:r>
+      <w:proofErr w:type="spellEnd"/>
+      <w:r>
+        <w:rPr>
+          <w:i/>
+          <w:iCs/>
+        </w:rPr>
+        <w:t xml:space="preserve"> </w:t>
+      </w:r>
+      <w:proofErr w:type="spellStart"/>
+      <w:r>
+        <w:rPr>
+          <w:i/>
+          <w:iCs/>
+        </w:rPr>
+        <w:t>Metric</w:t>
+      </w:r>
+      <w:proofErr w:type="spellEnd"/>
       <w:r>
         <w:t>): cada objetivo do Quadro 10 gera questões, respondidas pelas métricas do Quadro 11.</w:t>
       </w:r>
@@ -23233,7 +24392,23 @@
                 <w:sz w:val="18"/>
                 <w:szCs w:val="18"/>
               </w:rPr>
-              <w:t>A equipe entrega o que se comprometeu a entregar? (obj. 1)</w:t>
+              <w:t>A equipe entrega o que se comprometeu a entregar? (</w:t>
+            </w:r>
+            <w:proofErr w:type="spellStart"/>
+            <w:r>
+              <w:rPr>
+                <w:sz w:val="18"/>
+                <w:szCs w:val="18"/>
+              </w:rPr>
+              <w:t>obj</w:t>
+            </w:r>
+            <w:proofErr w:type="spellEnd"/>
+            <w:r>
+              <w:rPr>
+                <w:sz w:val="18"/>
+                <w:szCs w:val="18"/>
+              </w:rPr>
+              <w:t>. 1)</w:t>
             </w:r>
           </w:p>
         </w:tc>
@@ -23378,7 +24553,23 @@
                 <w:sz w:val="18"/>
                 <w:szCs w:val="18"/>
               </w:rPr>
-              <w:t>A equipe mantém um ritmo estável? (obj. 1)</w:t>
+              <w:t>A equipe mantém um ritmo estável? (</w:t>
+            </w:r>
+            <w:proofErr w:type="spellStart"/>
+            <w:r>
+              <w:rPr>
+                <w:sz w:val="18"/>
+                <w:szCs w:val="18"/>
+              </w:rPr>
+              <w:t>obj</w:t>
+            </w:r>
+            <w:proofErr w:type="spellEnd"/>
+            <w:r>
+              <w:rPr>
+                <w:sz w:val="18"/>
+                <w:szCs w:val="18"/>
+              </w:rPr>
+              <w:t>. 1)</w:t>
             </w:r>
           </w:p>
         </w:tc>
@@ -23523,7 +24714,23 @@
                 <w:sz w:val="18"/>
                 <w:szCs w:val="18"/>
               </w:rPr>
-              <w:t>A participação está equilibrada? (obj. 1)</w:t>
+              <w:t>A participação está equilibrada? (</w:t>
+            </w:r>
+            <w:proofErr w:type="spellStart"/>
+            <w:r>
+              <w:rPr>
+                <w:sz w:val="18"/>
+                <w:szCs w:val="18"/>
+              </w:rPr>
+              <w:t>obj</w:t>
+            </w:r>
+            <w:proofErr w:type="spellEnd"/>
+            <w:r>
+              <w:rPr>
+                <w:sz w:val="18"/>
+                <w:szCs w:val="18"/>
+              </w:rPr>
+              <w:t>. 1)</w:t>
             </w:r>
           </w:p>
         </w:tc>
@@ -23574,6 +24781,7 @@
                 <w:szCs w:val="18"/>
               </w:rPr>
             </w:pPr>
+            <w:proofErr w:type="spellStart"/>
             <w:r>
               <w:rPr>
                 <w:i/>
@@ -23583,6 +24791,7 @@
               </w:rPr>
               <w:t>Commits</w:t>
             </w:r>
+            <w:proofErr w:type="spellEnd"/>
             <w:r>
               <w:rPr>
                 <w:sz w:val="18"/>
@@ -23590,6 +24799,7 @@
               </w:rPr>
               <w:t xml:space="preserve"> e </w:t>
             </w:r>
+            <w:proofErr w:type="spellStart"/>
             <w:r>
               <w:rPr>
                 <w:i/>
@@ -23597,8 +24807,29 @@
                 <w:sz w:val="18"/>
                 <w:szCs w:val="18"/>
               </w:rPr>
-              <w:t>pull requests</w:t>
-            </w:r>
+              <w:t>pull</w:t>
+            </w:r>
+            <w:proofErr w:type="spellEnd"/>
+            <w:r>
+              <w:rPr>
+                <w:i/>
+                <w:iCs/>
+                <w:sz w:val="18"/>
+                <w:szCs w:val="18"/>
+              </w:rPr>
+              <w:t xml:space="preserve"> </w:t>
+            </w:r>
+            <w:proofErr w:type="spellStart"/>
+            <w:r>
+              <w:rPr>
+                <w:i/>
+                <w:iCs/>
+                <w:sz w:val="18"/>
+                <w:szCs w:val="18"/>
+              </w:rPr>
+              <w:t>requests</w:t>
+            </w:r>
+            <w:proofErr w:type="spellEnd"/>
             <w:r>
               <w:rPr>
                 <w:sz w:val="18"/>
@@ -23693,7 +24924,23 @@
                 <w:sz w:val="18"/>
                 <w:szCs w:val="18"/>
               </w:rPr>
-              <w:t>O código está coberto por testes? (obj. 2)</w:t>
+              <w:t>O código está coberto por testes? (</w:t>
+            </w:r>
+            <w:proofErr w:type="spellStart"/>
+            <w:r>
+              <w:rPr>
+                <w:sz w:val="18"/>
+                <w:szCs w:val="18"/>
+              </w:rPr>
+              <w:t>obj</w:t>
+            </w:r>
+            <w:proofErr w:type="spellEnd"/>
+            <w:r>
+              <w:rPr>
+                <w:sz w:val="18"/>
+                <w:szCs w:val="18"/>
+              </w:rPr>
+              <w:t>. 2)</w:t>
             </w:r>
           </w:p>
         </w:tc>
@@ -23777,6 +25024,13 @@
                 <w:sz w:val="18"/>
                 <w:szCs w:val="18"/>
               </w:rPr>
+              <w:t xml:space="preserve">Maior ou igual a </w:t>
+            </w:r>
+            <w:r>
+              <w:rPr>
+                <w:sz w:val="18"/>
+                <w:szCs w:val="18"/>
+              </w:rPr>
               <w:t>80%</w:t>
             </w:r>
           </w:p>
@@ -23807,6 +25061,7 @@
               </w:rPr>
               <w:t xml:space="preserve">Verificada a cada </w:t>
             </w:r>
+            <w:proofErr w:type="spellStart"/>
             <w:r>
               <w:rPr>
                 <w:i/>
@@ -23814,8 +25069,29 @@
                 <w:sz w:val="18"/>
                 <w:szCs w:val="18"/>
               </w:rPr>
-              <w:t>pull request</w:t>
-            </w:r>
+              <w:t>pull</w:t>
+            </w:r>
+            <w:proofErr w:type="spellEnd"/>
+            <w:r>
+              <w:rPr>
+                <w:i/>
+                <w:iCs/>
+                <w:sz w:val="18"/>
+                <w:szCs w:val="18"/>
+              </w:rPr>
+              <w:t xml:space="preserve"> </w:t>
+            </w:r>
+            <w:proofErr w:type="spellStart"/>
+            <w:r>
+              <w:rPr>
+                <w:i/>
+                <w:iCs/>
+                <w:sz w:val="18"/>
+                <w:szCs w:val="18"/>
+              </w:rPr>
+              <w:t>request</w:t>
+            </w:r>
+            <w:proofErr w:type="spellEnd"/>
             <w:r>
               <w:rPr>
                 <w:sz w:val="18"/>
@@ -23854,7 +25130,23 @@
                 <w:sz w:val="18"/>
                 <w:szCs w:val="18"/>
               </w:rPr>
-              <w:t>O produto é entregue com defeitos? (obj. 2)</w:t>
+              <w:t>O produto é entregue com defeitos? (</w:t>
+            </w:r>
+            <w:proofErr w:type="spellStart"/>
+            <w:r>
+              <w:rPr>
+                <w:sz w:val="18"/>
+                <w:szCs w:val="18"/>
+              </w:rPr>
+              <w:t>obj</w:t>
+            </w:r>
+            <w:proofErr w:type="spellEnd"/>
+            <w:r>
+              <w:rPr>
+                <w:sz w:val="18"/>
+                <w:szCs w:val="18"/>
+              </w:rPr>
+              <w:t>. 2)</w:t>
             </w:r>
           </w:p>
         </w:tc>
@@ -23966,7 +25258,23 @@
                 <w:sz w:val="18"/>
                 <w:szCs w:val="18"/>
               </w:rPr>
-              <w:t>Alta densidade prioriza a correção na sprint seguinte.</w:t>
+              <w:t xml:space="preserve">Alta densidade prioriza a correção </w:t>
+            </w:r>
+            <w:proofErr w:type="spellStart"/>
+            <w:r>
+              <w:rPr>
+                <w:sz w:val="18"/>
+                <w:szCs w:val="18"/>
+              </w:rPr>
+              <w:t>na</w:t>
+            </w:r>
+            <w:proofErr w:type="spellEnd"/>
+            <w:r>
+              <w:rPr>
+                <w:sz w:val="18"/>
+                <w:szCs w:val="18"/>
+              </w:rPr>
+              <w:t xml:space="preserve"> sprint seguinte.</w:t>
             </w:r>
           </w:p>
         </w:tc>
@@ -23999,7 +25307,23 @@
                 <w:sz w:val="18"/>
                 <w:szCs w:val="18"/>
               </w:rPr>
-              <w:t>Os usuários concluem as tarefas principais? (obj. 2)</w:t>
+              <w:t>Os usuários concluem as tarefas principais? (</w:t>
+            </w:r>
+            <w:proofErr w:type="spellStart"/>
+            <w:r>
+              <w:rPr>
+                <w:sz w:val="18"/>
+                <w:szCs w:val="18"/>
+              </w:rPr>
+              <w:t>obj</w:t>
+            </w:r>
+            <w:proofErr w:type="spellEnd"/>
+            <w:r>
+              <w:rPr>
+                <w:sz w:val="18"/>
+                <w:szCs w:val="18"/>
+              </w:rPr>
+              <w:t>. 2)</w:t>
             </w:r>
           </w:p>
         </w:tc>
@@ -24221,17 +25545,139 @@
         <w:t>Ambientes:</w:t>
       </w:r>
       <w:r>
-        <w:t xml:space="preserve"> testes unitários no ambiente local; integração validada na branch developer a cada </w:t>
-      </w:r>
+        <w:t xml:space="preserve"> testes unitários no ambiente local; integração validada na </w:t>
+      </w:r>
+      <w:proofErr w:type="spellStart"/>
+      <w:r>
+        <w:t>branch</w:t>
+      </w:r>
+      <w:proofErr w:type="spellEnd"/>
+      <w:r>
+        <w:t xml:space="preserve"> </w:t>
+      </w:r>
+      <w:proofErr w:type="spellStart"/>
+      <w:r>
+        <w:t>developer</w:t>
+      </w:r>
+      <w:proofErr w:type="spellEnd"/>
+      <w:r>
+        <w:t xml:space="preserve"> a cada </w:t>
+      </w:r>
+      <w:proofErr w:type="spellStart"/>
       <w:r>
         <w:rPr>
           <w:i/>
           <w:iCs/>
         </w:rPr>
-        <w:t>pull request</w:t>
-      </w:r>
-      <w:r>
-        <w:t>; a branch main recebe apenas o que cumpriu o conceito de pronto. Execução automatizada com Ruff e ESLint para a qualidade de software; pytest pytest-cov para o backend; React Testing Librar para as frameworks e Playwright e axe-core para UX.</w:t>
+        <w:t>pull</w:t>
+      </w:r>
+      <w:proofErr w:type="spellEnd"/>
+      <w:r>
+        <w:rPr>
+          <w:i/>
+          <w:iCs/>
+        </w:rPr>
+        <w:t xml:space="preserve"> </w:t>
+      </w:r>
+      <w:proofErr w:type="spellStart"/>
+      <w:r>
+        <w:rPr>
+          <w:i/>
+          <w:iCs/>
+        </w:rPr>
+        <w:t>request</w:t>
+      </w:r>
+      <w:proofErr w:type="spellEnd"/>
+      <w:r>
+        <w:t xml:space="preserve">; a </w:t>
+      </w:r>
+      <w:proofErr w:type="spellStart"/>
+      <w:r>
+        <w:t>branch</w:t>
+      </w:r>
+      <w:proofErr w:type="spellEnd"/>
+      <w:r>
+        <w:t xml:space="preserve"> </w:t>
+      </w:r>
+      <w:proofErr w:type="spellStart"/>
+      <w:r>
+        <w:t>main</w:t>
+      </w:r>
+      <w:proofErr w:type="spellEnd"/>
+      <w:r>
+        <w:t xml:space="preserve"> recebe apenas o que cumpriu o conceito de pronto. Execução automatizada com Ruff e </w:t>
+      </w:r>
+      <w:proofErr w:type="spellStart"/>
+      <w:r>
+        <w:t>ESLint</w:t>
+      </w:r>
+      <w:proofErr w:type="spellEnd"/>
+      <w:r>
+        <w:t xml:space="preserve"> para a qualidade de software; </w:t>
+      </w:r>
+      <w:proofErr w:type="spellStart"/>
+      <w:r>
+        <w:t>pytest</w:t>
+      </w:r>
+      <w:proofErr w:type="spellEnd"/>
+      <w:r>
+        <w:t xml:space="preserve"> </w:t>
+      </w:r>
+      <w:proofErr w:type="spellStart"/>
+      <w:r>
+        <w:t>pytest-cov</w:t>
+      </w:r>
+      <w:proofErr w:type="spellEnd"/>
+      <w:r>
+        <w:t xml:space="preserve"> para o </w:t>
+      </w:r>
+      <w:proofErr w:type="spellStart"/>
+      <w:r>
+        <w:t>backend</w:t>
+      </w:r>
+      <w:proofErr w:type="spellEnd"/>
+      <w:r>
+        <w:t xml:space="preserve">; </w:t>
+      </w:r>
+      <w:proofErr w:type="spellStart"/>
+      <w:r>
+        <w:t>React</w:t>
+      </w:r>
+      <w:proofErr w:type="spellEnd"/>
+      <w:r>
+        <w:t xml:space="preserve"> </w:t>
+      </w:r>
+      <w:proofErr w:type="spellStart"/>
+      <w:r>
+        <w:t>Testing</w:t>
+      </w:r>
+      <w:proofErr w:type="spellEnd"/>
+      <w:r>
+        <w:t xml:space="preserve"> Librar para </w:t>
+      </w:r>
+      <w:proofErr w:type="gramStart"/>
+      <w:r>
+        <w:t>as frameworks</w:t>
+      </w:r>
+      <w:proofErr w:type="gramEnd"/>
+      <w:r>
+        <w:t xml:space="preserve"> e </w:t>
+      </w:r>
+      <w:proofErr w:type="spellStart"/>
+      <w:r>
+        <w:t>Playwright</w:t>
+      </w:r>
+      <w:proofErr w:type="spellEnd"/>
+      <w:r>
+        <w:t xml:space="preserve"> e </w:t>
+      </w:r>
+      <w:proofErr w:type="spellStart"/>
+      <w:r>
+        <w:t>axe</w:t>
+      </w:r>
+      <w:proofErr w:type="spellEnd"/>
+      <w:r>
+        <w:t>-core para UX.</w:t>
       </w:r>
     </w:p>
     <w:p>
@@ -26608,7 +28054,15 @@
         </w:rPr>
       </w:pPr>
       <w:r>
-        <w:t xml:space="preserve">BASILI, Victor R.; CALDIERA, Gianluigi; ROMBACH, H. Dieter. </w:t>
+        <w:t xml:space="preserve">BASILI, Victor R.; CALDIERA, Gianluigi; ROMBACH, H. </w:t>
+      </w:r>
+      <w:proofErr w:type="spellStart"/>
+      <w:r>
+        <w:t>Dieter</w:t>
+      </w:r>
+      <w:proofErr w:type="spellEnd"/>
+      <w:r>
+        <w:t xml:space="preserve">. </w:t>
       </w:r>
       <w:r>
         <w:rPr>
@@ -26712,11 +28166,33 @@
       <w:r>
         <w:t xml:space="preserve">. </w:t>
       </w:r>
+      <w:proofErr w:type="spellStart"/>
       <w:r>
         <w:rPr>
           <w:lang w:val="en-US"/>
         </w:rPr>
-        <w:t>Acesso em: 30 set. 2026.</w:t>
+        <w:t>Acesso</w:t>
+      </w:r>
+      <w:proofErr w:type="spellEnd"/>
+      <w:r>
+        <w:rPr>
+          <w:lang w:val="en-US"/>
+        </w:rPr>
+        <w:t xml:space="preserve"> </w:t>
+      </w:r>
+      <w:proofErr w:type="spellStart"/>
+      <w:r>
+        <w:rPr>
+          <w:lang w:val="en-US"/>
+        </w:rPr>
+        <w:t>em</w:t>
+      </w:r>
+      <w:proofErr w:type="spellEnd"/>
+      <w:r>
+        <w:rPr>
+          <w:lang w:val="en-US"/>
+        </w:rPr>
+        <w:t>: 30 set. 2026.</w:t>
       </w:r>
     </w:p>
     <w:p>
@@ -26790,7 +28266,23 @@
         <w:t>PESQUISA Voluntariado no Brasil 2021</w:t>
       </w:r>
       <w:r>
-        <w:t xml:space="preserve">. Coordenação: Silvia Louzã Naccache. Realização: IDIS e Datafolha, 2022. </w:t>
+        <w:t xml:space="preserve">. Coordenação: Silvia </w:t>
+      </w:r>
+      <w:proofErr w:type="spellStart"/>
+      <w:r>
+        <w:t>Louzã</w:t>
+      </w:r>
+      <w:proofErr w:type="spellEnd"/>
+      <w:r>
+        <w:t xml:space="preserve"> </w:t>
+      </w:r>
+      <w:proofErr w:type="spellStart"/>
+      <w:r>
+        <w:t>Naccache</w:t>
+      </w:r>
+      <w:proofErr w:type="spellEnd"/>
+      <w:r>
+        <w:t xml:space="preserve">. Realização: IDIS e Datafolha, 2022. </w:t>
       </w:r>
       <w:r>
         <w:t xml:space="preserve">Disponível em: </w:t>
@@ -26820,7 +28312,15 @@
         <w:t>PESQUISA Voluntariado no Brasil 2026</w:t>
       </w:r>
       <w:r>
-        <w:t xml:space="preserve">. Coordenação: Silvia Naccache. Execução: Instituto Datafolha, 2026. </w:t>
+        <w:t xml:space="preserve">. Coordenação: Silvia </w:t>
+      </w:r>
+      <w:proofErr w:type="spellStart"/>
+      <w:r>
+        <w:t>Naccache</w:t>
+      </w:r>
+      <w:proofErr w:type="spellEnd"/>
+      <w:r>
+        <w:t xml:space="preserve">. Execução: Instituto Datafolha, 2026. </w:t>
       </w:r>
       <w:r>
         <w:t xml:space="preserve">Disponível em: </w:t>
@@ -30767,6 +32267,16 @@
 </file>
 
 <file path=customXml/item1.xml><?xml version="1.0" encoding="utf-8"?>
+<p:properties xmlns:p="http://schemas.microsoft.com/office/2006/metadata/properties" xmlns:xsi="http://www.w3.org/2001/XMLSchema-instance" xmlns:pc="http://schemas.microsoft.com/office/infopath/2007/PartnerControls">
+  <documentManagement>
+    <lcf76f155ced4ddcb4097134ff3c332f xmlns="d3dc9729-9892-4df7-b090-a44bbcc640fc">
+      <Terms xmlns="http://schemas.microsoft.com/office/infopath/2007/PartnerControls"/>
+    </lcf76f155ced4ddcb4097134ff3c332f>
+  </documentManagement>
+</p:properties>
+</file>
+
+<file path=customXml/item2.xml><?xml version="1.0" encoding="utf-8"?>
 <?mso-contentType ?>
 <FormTemplates xmlns="http://schemas.microsoft.com/sharepoint/v3/contenttype/forms">
   <Display>DocumentLibraryForm</Display>
@@ -30775,7 +32285,7 @@
 </FormTemplates>
 </file>
 
-<file path=customXml/item2.xml><?xml version="1.0" encoding="utf-8"?>
+<file path=customXml/item3.xml><?xml version="1.0" encoding="utf-8"?>
 <ct:contentTypeSchema xmlns:ct="http://schemas.microsoft.com/office/2006/metadata/contentType" xmlns:ma="http://schemas.microsoft.com/office/2006/metadata/properties/metaAttributes" ct:_="" ma:_="" ma:contentTypeName="Document" ma:contentTypeID="0x010100208D9B5AE6539949AFE2E609B4C6BB90" ma:contentTypeVersion="10" ma:contentTypeDescription="Create a new document." ma:contentTypeScope="" ma:versionID="33e2d388c36c2f9bbc768b7da53c5c24">
   <xsd:schema xmlns:xsd="http://www.w3.org/2001/XMLSchema" xmlns:xs="http://www.w3.org/2001/XMLSchema" xmlns:p="http://schemas.microsoft.com/office/2006/metadata/properties" xmlns:ns2="d3dc9729-9892-4df7-b090-a44bbcc640fc" targetNamespace="http://schemas.microsoft.com/office/2006/metadata/properties" ma:root="true" ma:fieldsID="6cd6d89e52ad14f961d62b676f1e0951" ns2:_="">
     <xsd:import namespace="d3dc9729-9892-4df7-b090-a44bbcc640fc"/>
@@ -30953,17 +32463,17 @@
 </ct:contentTypeSchema>
 </file>
 
-<file path=customXml/item3.xml><?xml version="1.0" encoding="utf-8"?>
-<p:properties xmlns:p="http://schemas.microsoft.com/office/2006/metadata/properties" xmlns:xsi="http://www.w3.org/2001/XMLSchema-instance" xmlns:pc="http://schemas.microsoft.com/office/infopath/2007/PartnerControls">
-  <documentManagement>
-    <lcf76f155ced4ddcb4097134ff3c332f xmlns="d3dc9729-9892-4df7-b090-a44bbcc640fc">
-      <Terms xmlns="http://schemas.microsoft.com/office/infopath/2007/PartnerControls"/>
-    </lcf76f155ced4ddcb4097134ff3c332f>
-  </documentManagement>
-</p:properties>
+<file path=customXml/itemProps1.xml><?xml version="1.0" encoding="utf-8"?>
+<ds:datastoreItem xmlns:ds="http://schemas.openxmlformats.org/officeDocument/2006/customXml" ds:itemID="{EE39F0FA-C005-4461-A332-EBC3ED84BC99}">
+  <ds:schemaRefs>
+    <ds:schemaRef ds:uri="http://schemas.microsoft.com/office/2006/metadata/properties"/>
+    <ds:schemaRef ds:uri="http://schemas.microsoft.com/office/infopath/2007/PartnerControls"/>
+    <ds:schemaRef ds:uri="d3dc9729-9892-4df7-b090-a44bbcc640fc"/>
+  </ds:schemaRefs>
+</ds:datastoreItem>
 </file>
 
-<file path=customXml/itemProps1.xml><?xml version="1.0" encoding="utf-8"?>
+<file path=customXml/itemProps2.xml><?xml version="1.0" encoding="utf-8"?>
 <ds:datastoreItem xmlns:ds="http://schemas.openxmlformats.org/officeDocument/2006/customXml" ds:itemID="{634F90EE-83B4-4E60-A707-4E7A94353B5A}">
   <ds:schemaRefs>
     <ds:schemaRef ds:uri="http://schemas.microsoft.com/sharepoint/v3/contenttype/forms"/>
@@ -30971,7 +32481,7 @@
 </ds:datastoreItem>
 </file>
 
-<file path=customXml/itemProps2.xml><?xml version="1.0" encoding="utf-8"?>
+<file path=customXml/itemProps3.xml><?xml version="1.0" encoding="utf-8"?>
 <ds:datastoreItem xmlns:ds="http://schemas.openxmlformats.org/officeDocument/2006/customXml" ds:itemID="{E38B0535-7E4E-476D-A9BB-281FD31E6A1F}">
   <ds:schemaRefs>
     <ds:schemaRef ds:uri="http://schemas.microsoft.com/office/2006/metadata/contentType"/>
@@ -30987,14 +32497,4 @@
     <ds:schemaRef ds:uri="http://schemas.microsoft.com/internal/obd"/>
   </ds:schemaRefs>
 </ds:datastoreItem>
-</file>
-
-<file path=customXml/itemProps3.xml><?xml version="1.0" encoding="utf-8"?>
-<ds:datastoreItem xmlns:ds="http://schemas.openxmlformats.org/officeDocument/2006/customXml" ds:itemID="{EE39F0FA-C005-4461-A332-EBC3ED84BC99}">
-  <ds:schemaRefs>
-    <ds:schemaRef ds:uri="http://schemas.microsoft.com/office/2006/metadata/properties"/>
-    <ds:schemaRef ds:uri="http://schemas.microsoft.com/office/infopath/2007/PartnerControls"/>
-    <ds:schemaRef ds:uri="d3dc9729-9892-4df7-b090-a44bbcc640fc"/>
-  </ds:schemaRefs>
-</ds:datastoreItem>
 </file>
</xml_diff>

<commit_message>
visao: ajuste do must cancelar registro de candidatura de usuarios padrão.
</commit_message>
<xml_diff>
--- a/docs/documento de visao.docx
+++ b/docs/documento de visao.docx
@@ -6346,7 +6346,24 @@
         </w:rPr>
         <w:t xml:space="preserve">, </w:t>
       </w:r>
-      <w:hyperlink r:id="rId18">
+      <w:hyperlink r:id="rId18" w:history="1">
+        <w:r>
+          <w:rPr>
+            <w:rStyle w:val="Hyperlink"/>
+            <w:sz w:val="20"/>
+            <w:szCs w:val="20"/>
+          </w:rPr>
+          <w:t>https://www.atados.com.br/</w:t>
+        </w:r>
+      </w:hyperlink>
+      <w:r>
+        <w:rPr>
+          <w:sz w:val="20"/>
+          <w:szCs w:val="20"/>
+        </w:rPr>
+        <w:t xml:space="preserve">, </w:t>
+      </w:r>
+      <w:hyperlink r:id="rId19" w:history="1">
         <w:r>
           <w:rPr>
             <w:rStyle w:val="Hyperlink"/>
@@ -7740,7 +7757,7 @@
                     </pic:cNvPicPr>
                   </pic:nvPicPr>
                   <pic:blipFill>
-                    <a:blip r:embed="rId19"/>
+                    <a:blip r:embed="rId20"/>
                     <a:stretch>
                       <a:fillRect/>
                     </a:stretch>
@@ -13266,7 +13283,7 @@
                     </pic:cNvPicPr>
                   </pic:nvPicPr>
                   <pic:blipFill>
-                    <a:blip r:embed="rId20"/>
+                    <a:blip r:embed="rId21"/>
                     <a:stretch>
                       <a:fillRect/>
                     </a:stretch>
@@ -14631,7 +14648,7 @@
       <w:r>
         <w:t xml:space="preserve">nas plataformas </w:t>
       </w:r>
-      <w:hyperlink r:id="rId21" w:history="1">
+      <w:hyperlink r:id="rId22" w:history="1">
         <w:r>
           <w:rPr>
             <w:rStyle w:val="Hyperlink"/>
@@ -14642,7 +14659,7 @@
       <w:r>
         <w:t xml:space="preserve">; </w:t>
       </w:r>
-      <w:hyperlink r:id="rId22" w:history="1">
+      <w:hyperlink r:id="rId23" w:history="1">
         <w:r>
           <w:rPr>
             <w:rStyle w:val="Hyperlink"/>
@@ -16346,12 +16363,12 @@
       <w:pPr>
         <w:pStyle w:val="Corpodetexto"/>
         <w:sectPr>
-          <w:headerReference w:type="even" r:id="rId23"/>
-          <w:headerReference w:type="default" r:id="rId24"/>
-          <w:footerReference w:type="even" r:id="rId25"/>
-          <w:footerReference w:type="default" r:id="rId26"/>
-          <w:headerReference w:type="first" r:id="rId27"/>
-          <w:footerReference w:type="first" r:id="rId28"/>
+          <w:headerReference w:type="even" r:id="rId24"/>
+          <w:headerReference w:type="default" r:id="rId25"/>
+          <w:footerReference w:type="even" r:id="rId26"/>
+          <w:footerReference w:type="default" r:id="rId27"/>
+          <w:headerReference w:type="first" r:id="rId28"/>
+          <w:footerReference w:type="first" r:id="rId29"/>
           <w:pgSz w:w="11906" w:h="16838"/>
           <w:pgMar w:top="1701" w:right="1134" w:bottom="1134" w:left="1701" w:header="1134" w:footer="567" w:gutter="0"/>
           <w:cols w:space="720"/>
@@ -20469,7 +20486,7 @@
                 <w:sz w:val="18"/>
                 <w:szCs w:val="18"/>
               </w:rPr>
-              <w:t>Should</w:t>
+              <w:t>Must</w:t>
             </w:r>
           </w:p>
         </w:tc>
@@ -23433,10 +23450,10 @@
           <w:szCs w:val="20"/>
         </w:rPr>
         <w:sectPr>
-          <w:headerReference w:type="default" r:id="rId29"/>
-          <w:footerReference w:type="default" r:id="rId30"/>
-          <w:headerReference w:type="first" r:id="rId31"/>
-          <w:footerReference w:type="first" r:id="rId32"/>
+          <w:headerReference w:type="default" r:id="rId30"/>
+          <w:footerReference w:type="default" r:id="rId31"/>
+          <w:headerReference w:type="first" r:id="rId32"/>
+          <w:footerReference w:type="first" r:id="rId33"/>
           <w:pgSz w:w="16838" w:h="11906" w:orient="landscape"/>
           <w:pgMar w:top="1701" w:right="1134" w:bottom="1134" w:left="1701" w:header="1134" w:footer="567" w:gutter="0"/>
           <w:cols w:space="720"/>
@@ -25709,10 +25726,10 @@
       <w:pPr>
         <w:pStyle w:val="Corpodetexto"/>
         <w:sectPr>
-          <w:headerReference w:type="default" r:id="rId33"/>
-          <w:footerReference w:type="default" r:id="rId34"/>
-          <w:headerReference w:type="first" r:id="rId35"/>
-          <w:footerReference w:type="first" r:id="rId36"/>
+          <w:headerReference w:type="default" r:id="rId34"/>
+          <w:footerReference w:type="default" r:id="rId35"/>
+          <w:headerReference w:type="first" r:id="rId36"/>
+          <w:footerReference w:type="first" r:id="rId37"/>
           <w:pgSz w:w="11906" w:h="16838"/>
           <w:pgMar w:top="1701" w:right="1134" w:bottom="1134" w:left="1701" w:header="1134" w:footer="567" w:gutter="0"/>
           <w:cols w:space="720"/>
@@ -27991,10 +28008,10 @@
           <w:szCs w:val="20"/>
         </w:rPr>
         <w:sectPr>
-          <w:headerReference w:type="default" r:id="rId37"/>
-          <w:footerReference w:type="default" r:id="rId38"/>
-          <w:headerReference w:type="first" r:id="rId39"/>
-          <w:footerReference w:type="first" r:id="rId40"/>
+          <w:headerReference w:type="default" r:id="rId38"/>
+          <w:footerReference w:type="default" r:id="rId39"/>
+          <w:headerReference w:type="first" r:id="rId40"/>
+          <w:footerReference w:type="first" r:id="rId41"/>
           <w:pgSz w:w="16838" w:h="11906" w:orient="landscape"/>
           <w:pgMar w:top="1701" w:right="1134" w:bottom="1134" w:left="1701" w:header="1134" w:footer="567" w:gutter="0"/>
           <w:cols w:space="720"/>
@@ -28155,7 +28172,7 @@
       <w:r>
         <w:t xml:space="preserve">Disponível em: </w:t>
       </w:r>
-      <w:hyperlink r:id="rId41" w:history="1">
+      <w:hyperlink r:id="rId42" w:history="1">
         <w:r>
           <w:rPr>
             <w:rStyle w:val="Hyperlink"/>
@@ -28287,7 +28304,7 @@
       <w:r>
         <w:t xml:space="preserve">Disponível em: </w:t>
       </w:r>
-      <w:hyperlink r:id="rId42" w:history="1">
+      <w:hyperlink r:id="rId43" w:history="1">
         <w:r>
           <w:rPr>
             <w:rStyle w:val="Hyperlink"/>
@@ -28325,7 +28342,7 @@
       <w:r>
         <w:t xml:space="preserve">Disponível em: </w:t>
       </w:r>
-      <w:hyperlink r:id="rId43" w:history="1">
+      <w:hyperlink r:id="rId44" w:history="1">
         <w:r>
           <w:rPr>
             <w:rStyle w:val="Hyperlink"/>
@@ -28395,10 +28412,10 @@
       </w:r>
     </w:p>
     <w:sectPr>
-      <w:headerReference w:type="default" r:id="rId44"/>
-      <w:footerReference w:type="default" r:id="rId45"/>
-      <w:headerReference w:type="first" r:id="rId46"/>
-      <w:footerReference w:type="first" r:id="rId47"/>
+      <w:headerReference w:type="default" r:id="rId45"/>
+      <w:footerReference w:type="default" r:id="rId46"/>
+      <w:headerReference w:type="first" r:id="rId47"/>
+      <w:footerReference w:type="first" r:id="rId48"/>
       <w:pgSz w:w="11906" w:h="16838"/>
       <w:pgMar w:top="1701" w:right="1134" w:bottom="1134" w:left="1701" w:header="1134" w:footer="567" w:gutter="0"/>
       <w:cols w:space="720"/>

</xml_diff>

<commit_message>
visao: modificacao do must de sistema de denuncia de usuarios e anuncios.
</commit_message>
<xml_diff>
--- a/docs/documento de visao.docx
+++ b/docs/documento de visao.docx
@@ -21973,7 +21973,14 @@
                 <w:sz w:val="18"/>
                 <w:szCs w:val="18"/>
               </w:rPr>
-              <w:t>Remover vagas irregulares e suspender contas.</w:t>
+              <w:t>Remover vagas irregulares e suspender contas</w:t>
+            </w:r>
+            <w:r>
+              <w:rPr>
+                <w:sz w:val="18"/>
+                <w:szCs w:val="18"/>
+              </w:rPr>
+              <w:t xml:space="preserve"> a partir de denúncias, com um botão de denúncia que alerta o painel do administrador do sistema.</w:t>
             </w:r>
           </w:p>
         </w:tc>
@@ -23455,7 +23462,7 @@
           <w:headerReference w:type="first" r:id="rId32"/>
           <w:footerReference w:type="first" r:id="rId33"/>
           <w:pgSz w:w="16838" w:h="11906" w:orient="landscape"/>
-          <w:pgMar w:top="1701" w:right="1134" w:bottom="1134" w:left="1701" w:header="1134" w:footer="567" w:gutter="0"/>
+          <w:pgMar w:top="1701" w:right="1134" w:bottom="993" w:left="1701" w:header="1134" w:footer="567" w:gutter="0"/>
           <w:cols w:space="720"/>
           <w:formProt w:val="0"/>
           <w:docGrid w:linePitch="326"/>

</xml_diff>